<commit_message>
minor changes made in documentation;
</commit_message>
<xml_diff>
--- a/docs/PLO1.docx
+++ b/docs/PLO1.docx
@@ -28,105 +28,124 @@
           <w:sz w:val="28"/>
           <w:szCs w:val="28"/>
         </w:rPr>
-        <w:t>1</w:t>
-      </w:r>
-      <w:r>
-        <w:rPr>
+        <w:t>1 :</w:t>
+      </w:r>
+      <w:proofErr w:type="gramEnd"/>
+      <w:r>
+        <w:rPr>
+          <w:b/>
+          <w:bCs/>
           <w:sz w:val="28"/>
           <w:szCs w:val="28"/>
         </w:rPr>
-        <w:t xml:space="preserve"> </w:t>
-      </w:r>
-      <w:r>
-        <w:rPr>
-          <w:b/>
-          <w:bCs/>
-          <w:sz w:val="28"/>
-          <w:szCs w:val="28"/>
-        </w:rPr>
-        <w:t>:</w:t>
+        <w:t xml:space="preserve"> Write a program that compares two strings and checks for substring presence.</w:t>
+      </w:r>
+    </w:p>
+    <w:p>
+      <w:pPr>
+        <w:spacing w:after="0"/>
+        <w:ind w:left="720"/>
+      </w:pPr>
+    </w:p>
+    <w:p>
+      <w:pPr>
+        <w:spacing w:after="0"/>
+        <w:ind w:left="720"/>
+      </w:pPr>
+      <w:r>
+        <w:t>public class Program1 {</w:t>
+      </w:r>
+    </w:p>
+    <w:p>
+      <w:pPr>
+        <w:spacing w:after="0"/>
+        <w:ind w:left="720"/>
+      </w:pPr>
+      <w:r>
+        <w:tab/>
+        <w:t xml:space="preserve">public static void </w:t>
+      </w:r>
+      <w:proofErr w:type="gramStart"/>
+      <w:r>
+        <w:t>main(</w:t>
       </w:r>
       <w:proofErr w:type="gramEnd"/>
       <w:r>
-        <w:rPr>
-          <w:b/>
-          <w:bCs/>
-          <w:sz w:val="28"/>
-          <w:szCs w:val="28"/>
-        </w:rPr>
-        <w:t xml:space="preserve"> Write a program that compares two strings and checks for substring presence.</w:t>
-      </w:r>
-    </w:p>
-    <w:p>
-      <w:pPr>
-        <w:spacing w:after="0"/>
-        <w:ind w:left="720"/>
-      </w:pPr>
-      <w:r>
-        <w:t>public class Program1 {</w:t>
-      </w:r>
-    </w:p>
-    <w:p>
-      <w:pPr>
-        <w:spacing w:after="0"/>
-        <w:ind w:left="720"/>
-      </w:pPr>
-      <w:r>
-        <w:tab/>
-        <w:t xml:space="preserve">public static void </w:t>
+        <w:t xml:space="preserve">String[] </w:t>
+      </w:r>
+      <w:proofErr w:type="spellStart"/>
+      <w:r>
+        <w:t>args</w:t>
+      </w:r>
+      <w:proofErr w:type="spellEnd"/>
+      <w:r>
+        <w:t>) {</w:t>
+      </w:r>
+    </w:p>
+    <w:p>
+      <w:pPr>
+        <w:spacing w:after="0"/>
+        <w:ind w:left="720"/>
+      </w:pPr>
+      <w:r>
+        <w:t>// PROGRAM 1:</w:t>
+      </w:r>
+    </w:p>
+    <w:p>
+      <w:pPr>
+        <w:spacing w:after="0"/>
+        <w:ind w:left="720"/>
+      </w:pPr>
+      <w:r>
+        <w:t>// WRITE A PROGRAM THAT COMPARES TWO STRINGS AND CHECKS FOR SUBSTRING PRESENCE.</w:t>
+      </w:r>
+    </w:p>
+    <w:p>
+      <w:pPr>
+        <w:spacing w:after="0"/>
+        <w:ind w:left="720"/>
+      </w:pPr>
+    </w:p>
+    <w:p>
+      <w:pPr>
+        <w:spacing w:after="0"/>
+        <w:ind w:left="720"/>
+      </w:pPr>
+      <w:r>
+        <w:tab/>
+      </w:r>
+      <w:r>
+        <w:tab/>
+        <w:t>String str = "</w:t>
+      </w:r>
+      <w:proofErr w:type="spellStart"/>
+      <w:r>
+        <w:t>Hellow</w:t>
+      </w:r>
+      <w:proofErr w:type="spellEnd"/>
+      <w:r>
+        <w:t xml:space="preserve"> World !!";</w:t>
+      </w:r>
+    </w:p>
+    <w:p>
+      <w:pPr>
+        <w:spacing w:after="0"/>
+        <w:ind w:left="720"/>
+      </w:pPr>
+      <w:r>
+        <w:tab/>
+      </w:r>
+      <w:r>
+        <w:tab/>
+        <w:t xml:space="preserve">String str1 = new </w:t>
       </w:r>
       <w:proofErr w:type="gramStart"/>
       <w:r>
-        <w:t>main(</w:t>
+        <w:t>String(</w:t>
       </w:r>
       <w:proofErr w:type="gramEnd"/>
       <w:r>
-        <w:t xml:space="preserve">String[] </w:t>
-      </w:r>
-      <w:proofErr w:type="spellStart"/>
-      <w:r>
-        <w:t>args</w:t>
-      </w:r>
-      <w:proofErr w:type="spellEnd"/>
-      <w:r>
-        <w:t>) {</w:t>
-      </w:r>
-    </w:p>
-    <w:p>
-      <w:pPr>
-        <w:spacing w:after="0"/>
-        <w:ind w:left="720"/>
-      </w:pPr>
-      <w:r>
-        <w:t>// PROGRAM 1:</w:t>
-      </w:r>
-    </w:p>
-    <w:p>
-      <w:pPr>
-        <w:spacing w:after="0"/>
-        <w:ind w:left="720"/>
-      </w:pPr>
-      <w:r>
-        <w:t>// WRITE A PROGRAM THAT COMPARES TWO STRINGS AND CHECKS FOR SUBSTRING PRESENCE.</w:t>
-      </w:r>
-    </w:p>
-    <w:p>
-      <w:pPr>
-        <w:spacing w:after="0"/>
-        <w:ind w:left="720"/>
-      </w:pPr>
-    </w:p>
-    <w:p>
-      <w:pPr>
-        <w:spacing w:after="0"/>
-        <w:ind w:left="720"/>
-      </w:pPr>
-      <w:r>
-        <w:tab/>
-      </w:r>
-      <w:r>
-        <w:tab/>
-        <w:t>String str = "</w:t>
+        <w:t>"</w:t>
       </w:r>
       <w:proofErr w:type="spellStart"/>
       <w:r>
@@ -134,83 +153,123 @@
       </w:r>
       <w:proofErr w:type="spellEnd"/>
       <w:r>
-        <w:t xml:space="preserve"> World !!";</w:t>
-      </w:r>
-    </w:p>
-    <w:p>
-      <w:pPr>
-        <w:spacing w:after="0"/>
-        <w:ind w:left="720"/>
-      </w:pPr>
-      <w:r>
-        <w:tab/>
-      </w:r>
-      <w:r>
-        <w:tab/>
-        <w:t xml:space="preserve">String str1 = new </w:t>
+        <w:t xml:space="preserve"> World !!");</w:t>
+      </w:r>
+    </w:p>
+    <w:p>
+      <w:pPr>
+        <w:spacing w:after="0"/>
+        <w:ind w:left="720"/>
+      </w:pPr>
+      <w:r>
+        <w:tab/>
+      </w:r>
+      <w:r>
+        <w:tab/>
+        <w:t>String str2 = "HELLOW WORLD !!";</w:t>
+      </w:r>
+    </w:p>
+    <w:p>
+      <w:pPr>
+        <w:spacing w:after="0"/>
+        <w:ind w:left="720"/>
+      </w:pPr>
+      <w:r>
+        <w:tab/>
+      </w:r>
+      <w:r>
+        <w:tab/>
+        <w:t xml:space="preserve">String </w:t>
+      </w:r>
+      <w:proofErr w:type="spellStart"/>
+      <w:r>
+        <w:t>subStr</w:t>
+      </w:r>
+      <w:proofErr w:type="spellEnd"/>
+      <w:r>
+        <w:t xml:space="preserve"> = "World !!";</w:t>
+      </w:r>
+    </w:p>
+    <w:p>
+      <w:pPr>
+        <w:spacing w:after="0"/>
+        <w:ind w:left="720"/>
+      </w:pPr>
+    </w:p>
+    <w:p>
+      <w:pPr>
+        <w:spacing w:after="0"/>
+        <w:ind w:left="720"/>
+      </w:pPr>
+      <w:r>
+        <w:tab/>
+      </w:r>
+      <w:r>
+        <w:tab/>
+      </w:r>
+      <w:proofErr w:type="spellStart"/>
+      <w:r>
+        <w:t>System.out.println</w:t>
+      </w:r>
+      <w:proofErr w:type="spellEnd"/>
+      <w:r>
+        <w:t>("*** Program 1: ***\n");</w:t>
+      </w:r>
+    </w:p>
+    <w:p>
+      <w:pPr>
+        <w:spacing w:after="0"/>
+        <w:ind w:left="720"/>
+      </w:pPr>
+    </w:p>
+    <w:p>
+      <w:pPr>
+        <w:spacing w:after="0"/>
+        <w:ind w:left="720"/>
+      </w:pPr>
+      <w:r>
+        <w:t xml:space="preserve">// USING </w:t>
       </w:r>
       <w:proofErr w:type="gramStart"/>
       <w:r>
-        <w:t>String(</w:t>
+        <w:t>equals(</w:t>
       </w:r>
       <w:proofErr w:type="gramEnd"/>
       <w:r>
-        <w:t>"</w:t>
-      </w:r>
-      <w:proofErr w:type="spellStart"/>
-      <w:r>
-        <w:t>Hellow</w:t>
-      </w:r>
-      <w:proofErr w:type="spellEnd"/>
-      <w:r>
-        <w:t xml:space="preserve"> World !!");</w:t>
-      </w:r>
-    </w:p>
-    <w:p>
-      <w:pPr>
-        <w:spacing w:after="0"/>
-        <w:ind w:left="720"/>
-      </w:pPr>
-      <w:r>
-        <w:tab/>
-      </w:r>
-      <w:r>
-        <w:tab/>
-        <w:t>String str2 = "HELLOW WORLD !!";</w:t>
-      </w:r>
-    </w:p>
-    <w:p>
-      <w:pPr>
-        <w:spacing w:after="0"/>
-        <w:ind w:left="720"/>
-      </w:pPr>
-      <w:r>
-        <w:tab/>
-      </w:r>
-      <w:r>
-        <w:tab/>
-        <w:t xml:space="preserve">String </w:t>
-      </w:r>
-      <w:proofErr w:type="spellStart"/>
-      <w:r>
-        <w:t>subStr</w:t>
-      </w:r>
-      <w:proofErr w:type="spellEnd"/>
-      <w:r>
-        <w:t xml:space="preserve"> = "World !!";</w:t>
-      </w:r>
-    </w:p>
-    <w:p>
-      <w:pPr>
-        <w:spacing w:after="0"/>
-        <w:ind w:left="720"/>
-      </w:pPr>
-    </w:p>
-    <w:p>
-      <w:pPr>
-        <w:spacing w:after="0"/>
-        <w:ind w:left="720"/>
-      </w:pPr>
+        <w:t>) METHOD (CASE SENSITIVE COMPARISON)</w:t>
+      </w:r>
+    </w:p>
+    <w:p>
+      <w:pPr>
+        <w:spacing w:after="0"/>
+        <w:ind w:left="720"/>
+      </w:pPr>
+      <w:r>
+        <w:tab/>
+      </w:r>
+      <w:r>
+        <w:tab/>
+        <w:t>if (</w:t>
+      </w:r>
+      <w:proofErr w:type="spellStart"/>
+      <w:proofErr w:type="gramStart"/>
+      <w:r>
+        <w:t>str.equals</w:t>
+      </w:r>
+      <w:proofErr w:type="spellEnd"/>
+      <w:proofErr w:type="gramEnd"/>
+      <w:r>
+        <w:t>(str1)) {</w:t>
+      </w:r>
+    </w:p>
+    <w:p>
+      <w:pPr>
+        <w:spacing w:after="0"/>
+        <w:ind w:left="720"/>
+      </w:pPr>
+      <w:r>
+        <w:tab/>
+      </w:r>
       <w:r>
         <w:tab/>
       </w:r>
@@ -223,7 +282,81 @@
       </w:r>
       <w:proofErr w:type="spellEnd"/>
       <w:r>
-        <w:t>("*** Program 1: ***\n");</w:t>
+        <w:t xml:space="preserve">("Str &amp; str1 are equal using </w:t>
+      </w:r>
+      <w:proofErr w:type="gramStart"/>
+      <w:r>
+        <w:t>equals(</w:t>
+      </w:r>
+      <w:proofErr w:type="gramEnd"/>
+      <w:r>
+        <w:t>)");</w:t>
+      </w:r>
+    </w:p>
+    <w:p>
+      <w:pPr>
+        <w:spacing w:after="0"/>
+        <w:ind w:left="720"/>
+      </w:pPr>
+      <w:r>
+        <w:tab/>
+      </w:r>
+      <w:r>
+        <w:tab/>
+        <w:t>} else {</w:t>
+      </w:r>
+    </w:p>
+    <w:p>
+      <w:pPr>
+        <w:spacing w:after="0"/>
+        <w:ind w:left="720"/>
+      </w:pPr>
+      <w:r>
+        <w:tab/>
+      </w:r>
+      <w:r>
+        <w:tab/>
+      </w:r>
+      <w:r>
+        <w:tab/>
+      </w:r>
+      <w:proofErr w:type="spellStart"/>
+      <w:r>
+        <w:t>System.out.println</w:t>
+      </w:r>
+      <w:proofErr w:type="spellEnd"/>
+      <w:r>
+        <w:t xml:space="preserve">("Str &amp; str1 are not equal using </w:t>
+      </w:r>
+      <w:proofErr w:type="gramStart"/>
+      <w:r>
+        <w:t>equals(</w:t>
+      </w:r>
+      <w:proofErr w:type="gramEnd"/>
+      <w:r>
+        <w:t>)");</w:t>
+      </w:r>
+    </w:p>
+    <w:p>
+      <w:pPr>
+        <w:spacing w:after="0"/>
+        <w:ind w:left="720"/>
+      </w:pPr>
+      <w:r>
+        <w:tab/>
+      </w:r>
+      <w:r>
+        <w:tab/>
+        <w:t>}</w:t>
+      </w:r>
+    </w:p>
+    <w:p>
+      <w:pPr>
+        <w:spacing w:after="0"/>
+        <w:ind w:left="720"/>
+      </w:pPr>
+      <w:r>
+        <w:t>//----------------------------------------------------------------------------</w:t>
       </w:r>
     </w:p>
     <w:p>
@@ -240,13 +373,18 @@
       <w:r>
         <w:t xml:space="preserve">// USING </w:t>
       </w:r>
+      <w:proofErr w:type="spellStart"/>
       <w:proofErr w:type="gramStart"/>
       <w:r>
-        <w:t>equals(</w:t>
+        <w:t>equalIgnoreCase</w:t>
+      </w:r>
+      <w:proofErr w:type="spellEnd"/>
+      <w:r>
+        <w:t>(</w:t>
       </w:r>
       <w:proofErr w:type="gramEnd"/>
       <w:r>
-        <w:t>) METHOD (CASE SENSITIVE COMPARISON)</w:t>
+        <w:t>) METHOD (CASE INSENSITIVE COMPARISION)</w:t>
       </w:r>
     </w:p>
     <w:p>
@@ -264,12 +402,12 @@
       <w:proofErr w:type="spellStart"/>
       <w:proofErr w:type="gramStart"/>
       <w:r>
-        <w:t>str.equals</w:t>
+        <w:t>str.equalsIgnoreCase</w:t>
       </w:r>
       <w:proofErr w:type="spellEnd"/>
       <w:proofErr w:type="gramEnd"/>
       <w:r>
-        <w:t>(str1)) {</w:t>
+        <w:t>(str2)) {</w:t>
       </w:r>
     </w:p>
     <w:p>
@@ -292,11 +430,16 @@
       </w:r>
       <w:proofErr w:type="spellEnd"/>
       <w:r>
-        <w:t xml:space="preserve">("Str &amp; str1 are equal using </w:t>
-      </w:r>
+        <w:t xml:space="preserve">("str &amp; str2 are equal using </w:t>
+      </w:r>
+      <w:proofErr w:type="spellStart"/>
       <w:proofErr w:type="gramStart"/>
       <w:r>
-        <w:t>equals(</w:t>
+        <w:t>equalIgnoreCase</w:t>
+      </w:r>
+      <w:proofErr w:type="spellEnd"/>
+      <w:r>
+        <w:t>(</w:t>
       </w:r>
       <w:proofErr w:type="gramEnd"/>
       <w:r>
@@ -336,11 +479,16 @@
       </w:r>
       <w:proofErr w:type="spellEnd"/>
       <w:r>
-        <w:t xml:space="preserve">("Str &amp; str1 are not equal using </w:t>
-      </w:r>
+        <w:t xml:space="preserve">("str &amp; str2 are not equal using </w:t>
+      </w:r>
+      <w:proofErr w:type="spellStart"/>
       <w:proofErr w:type="gramStart"/>
       <w:r>
-        <w:t>equals(</w:t>
+        <w:t>equalIgnoreCase</w:t>
+      </w:r>
+      <w:proofErr w:type="spellEnd"/>
+      <w:r>
+        <w:t>(</w:t>
       </w:r>
       <w:proofErr w:type="gramEnd"/>
       <w:r>
@@ -366,7 +514,116 @@
         <w:ind w:left="720"/>
       </w:pPr>
       <w:r>
-        <w:t>//----------------------------------------------------------------------------</w:t>
+        <w:t>// ----------------------------------------------------------------------------</w:t>
+      </w:r>
+    </w:p>
+    <w:p>
+      <w:pPr>
+        <w:spacing w:after="0"/>
+        <w:ind w:left="720"/>
+      </w:pPr>
+    </w:p>
+    <w:p>
+      <w:pPr>
+        <w:spacing w:after="0"/>
+        <w:ind w:left="720"/>
+      </w:pPr>
+      <w:r>
+        <w:t>// USING == OPERATOR</w:t>
+      </w:r>
+    </w:p>
+    <w:p>
+      <w:pPr>
+        <w:spacing w:after="0"/>
+        <w:ind w:left="720"/>
+      </w:pPr>
+      <w:r>
+        <w:tab/>
+      </w:r>
+      <w:r>
+        <w:tab/>
+        <w:t>if (str == str1) {</w:t>
+      </w:r>
+    </w:p>
+    <w:p>
+      <w:pPr>
+        <w:spacing w:after="0"/>
+        <w:ind w:left="720"/>
+      </w:pPr>
+      <w:r>
+        <w:tab/>
+      </w:r>
+      <w:r>
+        <w:tab/>
+      </w:r>
+      <w:r>
+        <w:tab/>
+      </w:r>
+      <w:proofErr w:type="spellStart"/>
+      <w:r>
+        <w:t>System.out.println</w:t>
+      </w:r>
+      <w:proofErr w:type="spellEnd"/>
+      <w:r>
+        <w:t>("str &amp; str1 object are equal using == ");</w:t>
+      </w:r>
+    </w:p>
+    <w:p>
+      <w:pPr>
+        <w:spacing w:after="0"/>
+        <w:ind w:left="720"/>
+      </w:pPr>
+      <w:r>
+        <w:tab/>
+      </w:r>
+      <w:r>
+        <w:tab/>
+        <w:t>} else {</w:t>
+      </w:r>
+    </w:p>
+    <w:p>
+      <w:pPr>
+        <w:spacing w:after="0"/>
+        <w:ind w:left="720"/>
+      </w:pPr>
+      <w:r>
+        <w:tab/>
+      </w:r>
+      <w:r>
+        <w:tab/>
+      </w:r>
+      <w:r>
+        <w:tab/>
+      </w:r>
+      <w:proofErr w:type="spellStart"/>
+      <w:r>
+        <w:t>System.out.println</w:t>
+      </w:r>
+      <w:proofErr w:type="spellEnd"/>
+      <w:r>
+        <w:t>("str &amp; str1 object are not equal using == ");</w:t>
+      </w:r>
+    </w:p>
+    <w:p>
+      <w:pPr>
+        <w:spacing w:after="0"/>
+        <w:ind w:left="720"/>
+      </w:pPr>
+      <w:r>
+        <w:tab/>
+      </w:r>
+      <w:r>
+        <w:tab/>
+        <w:t>}</w:t>
+      </w:r>
+    </w:p>
+    <w:p>
+      <w:pPr>
+        <w:spacing w:after="0"/>
+        <w:ind w:left="720"/>
+      </w:pPr>
+      <w:r>
+        <w:t>// ----------------------------------------------------------------------------</w:t>
       </w:r>
     </w:p>
     <w:p>
@@ -386,7 +643,7 @@
       <w:proofErr w:type="spellStart"/>
       <w:proofErr w:type="gramStart"/>
       <w:r>
-        <w:t>equalIgnoreCase</w:t>
+        <w:t>compareTo</w:t>
       </w:r>
       <w:proofErr w:type="spellEnd"/>
       <w:r>
@@ -394,30 +651,49 @@
       </w:r>
       <w:proofErr w:type="gramEnd"/>
       <w:r>
-        <w:t>) METHOD (CASE INSENSITIVE COMPARISION)</w:t>
-      </w:r>
-    </w:p>
-    <w:p>
-      <w:pPr>
-        <w:spacing w:after="0"/>
-        <w:ind w:left="720"/>
-      </w:pPr>
-      <w:r>
-        <w:tab/>
-      </w:r>
-      <w:r>
-        <w:tab/>
-        <w:t>if (</w:t>
+        <w:t>) method (LEXICOGRAPHICAL COMPARISON)</w:t>
+      </w:r>
+    </w:p>
+    <w:p>
+      <w:pPr>
+        <w:spacing w:after="0"/>
+        <w:ind w:left="720"/>
+      </w:pPr>
+      <w:r>
+        <w:tab/>
+      </w:r>
+      <w:r>
+        <w:tab/>
+        <w:t xml:space="preserve">int result = </w:t>
       </w:r>
       <w:proofErr w:type="spellStart"/>
       <w:proofErr w:type="gramStart"/>
       <w:r>
-        <w:t>str.equalsIgnoreCase</w:t>
+        <w:t>str.compareTo</w:t>
       </w:r>
       <w:proofErr w:type="spellEnd"/>
       <w:proofErr w:type="gramEnd"/>
       <w:r>
-        <w:t>(str2)) {</w:t>
+        <w:t>(str1);</w:t>
+      </w:r>
+    </w:p>
+    <w:p>
+      <w:pPr>
+        <w:spacing w:after="0"/>
+        <w:ind w:left="720"/>
+      </w:pPr>
+    </w:p>
+    <w:p>
+      <w:pPr>
+        <w:spacing w:after="0"/>
+        <w:ind w:left="720"/>
+      </w:pPr>
+      <w:r>
+        <w:tab/>
+      </w:r>
+      <w:r>
+        <w:tab/>
+        <w:t>if (result == 0) {</w:t>
       </w:r>
     </w:p>
     <w:p>
@@ -440,12 +716,12 @@
       </w:r>
       <w:proofErr w:type="spellEnd"/>
       <w:r>
-        <w:t xml:space="preserve">("str &amp; str2 are equal using </w:t>
+        <w:t xml:space="preserve">("str and str1 are equal using </w:t>
       </w:r>
       <w:proofErr w:type="spellStart"/>
       <w:proofErr w:type="gramStart"/>
       <w:r>
-        <w:t>equalIgnoreCase</w:t>
+        <w:t>compareTo</w:t>
       </w:r>
       <w:proofErr w:type="spellEnd"/>
       <w:r>
@@ -462,292 +738,7 @@
         <w:ind w:left="720"/>
       </w:pPr>
       <w:r>
-        <w:tab/>
-      </w:r>
-      <w:r>
-        <w:tab/>
-        <w:t>} else {</w:t>
-      </w:r>
-    </w:p>
-    <w:p>
-      <w:pPr>
-        <w:spacing w:after="0"/>
-        <w:ind w:left="720"/>
-      </w:pPr>
-      <w:r>
-        <w:tab/>
-      </w:r>
-      <w:r>
-        <w:tab/>
-      </w:r>
-      <w:r>
-        <w:tab/>
-      </w:r>
-      <w:proofErr w:type="spellStart"/>
-      <w:r>
-        <w:t>System.out.println</w:t>
-      </w:r>
-      <w:proofErr w:type="spellEnd"/>
-      <w:r>
-        <w:t xml:space="preserve">("str &amp; str2 are not equal using </w:t>
-      </w:r>
-      <w:proofErr w:type="spellStart"/>
-      <w:proofErr w:type="gramStart"/>
-      <w:r>
-        <w:t>equalIgnoreCase</w:t>
-      </w:r>
-      <w:proofErr w:type="spellEnd"/>
-      <w:r>
-        <w:t>(</w:t>
-      </w:r>
-      <w:proofErr w:type="gramEnd"/>
-      <w:r>
-        <w:t>)");</w:t>
-      </w:r>
-    </w:p>
-    <w:p>
-      <w:pPr>
-        <w:spacing w:after="0"/>
-        <w:ind w:left="720"/>
-      </w:pPr>
-      <w:r>
-        <w:tab/>
-      </w:r>
-      <w:r>
-        <w:tab/>
-        <w:t>}</w:t>
-      </w:r>
-    </w:p>
-    <w:p>
-      <w:pPr>
-        <w:spacing w:after="0"/>
-        <w:ind w:left="720"/>
-      </w:pPr>
-      <w:r>
-        <w:t>// ----------------------------------------------------------------------------</w:t>
-      </w:r>
-    </w:p>
-    <w:p>
-      <w:pPr>
-        <w:spacing w:after="0"/>
-        <w:ind w:left="720"/>
-      </w:pPr>
-    </w:p>
-    <w:p>
-      <w:pPr>
-        <w:spacing w:after="0"/>
-        <w:ind w:left="720"/>
-      </w:pPr>
-      <w:r>
-        <w:t>// USING == OPERATOR</w:t>
-      </w:r>
-    </w:p>
-    <w:p>
-      <w:pPr>
-        <w:spacing w:after="0"/>
-        <w:ind w:left="720"/>
-      </w:pPr>
-      <w:r>
-        <w:tab/>
-      </w:r>
-      <w:r>
-        <w:tab/>
-        <w:t>if (str == str1) {</w:t>
-      </w:r>
-    </w:p>
-    <w:p>
-      <w:pPr>
-        <w:spacing w:after="0"/>
-        <w:ind w:left="720"/>
-      </w:pPr>
-      <w:r>
-        <w:tab/>
-      </w:r>
-      <w:r>
-        <w:tab/>
-      </w:r>
-      <w:r>
-        <w:tab/>
-      </w:r>
-      <w:proofErr w:type="spellStart"/>
-      <w:r>
-        <w:t>System.out.println</w:t>
-      </w:r>
-      <w:proofErr w:type="spellEnd"/>
-      <w:r>
-        <w:t>("str &amp; str1 object are equal using == ");</w:t>
-      </w:r>
-    </w:p>
-    <w:p>
-      <w:pPr>
-        <w:spacing w:after="0"/>
-        <w:ind w:left="720"/>
-      </w:pPr>
-      <w:r>
-        <w:tab/>
-      </w:r>
-      <w:r>
-        <w:tab/>
-        <w:t>} else {</w:t>
-      </w:r>
-    </w:p>
-    <w:p>
-      <w:pPr>
-        <w:spacing w:after="0"/>
-        <w:ind w:left="720"/>
-      </w:pPr>
-      <w:r>
-        <w:tab/>
-      </w:r>
-      <w:r>
-        <w:tab/>
-      </w:r>
-      <w:r>
-        <w:tab/>
-      </w:r>
-      <w:proofErr w:type="spellStart"/>
-      <w:r>
-        <w:t>System.out.println</w:t>
-      </w:r>
-      <w:proofErr w:type="spellEnd"/>
-      <w:r>
-        <w:t>("str &amp; str1 object are not equal using == ");</w:t>
-      </w:r>
-    </w:p>
-    <w:p>
-      <w:pPr>
-        <w:spacing w:after="0"/>
-        <w:ind w:left="720"/>
-      </w:pPr>
-      <w:r>
-        <w:tab/>
-      </w:r>
-      <w:r>
-        <w:tab/>
-        <w:t>}</w:t>
-      </w:r>
-    </w:p>
-    <w:p>
-      <w:pPr>
-        <w:spacing w:after="0"/>
-        <w:ind w:left="720"/>
-      </w:pPr>
-      <w:r>
-        <w:t>// ----------------------------------------------------------------------------</w:t>
-      </w:r>
-    </w:p>
-    <w:p>
-      <w:pPr>
-        <w:spacing w:after="0"/>
-        <w:ind w:left="720"/>
-      </w:pPr>
-    </w:p>
-    <w:p>
-      <w:pPr>
-        <w:spacing w:after="0"/>
-        <w:ind w:left="720"/>
-      </w:pPr>
-      <w:r>
-        <w:t xml:space="preserve">// USING </w:t>
-      </w:r>
-      <w:proofErr w:type="spellStart"/>
-      <w:proofErr w:type="gramStart"/>
-      <w:r>
-        <w:t>compareTo</w:t>
-      </w:r>
-      <w:proofErr w:type="spellEnd"/>
-      <w:r>
-        <w:t>(</w:t>
-      </w:r>
-      <w:proofErr w:type="gramEnd"/>
-      <w:r>
-        <w:t>) method (LEXICOGRAPHICAL COMPARISON)</w:t>
-      </w:r>
-    </w:p>
-    <w:p>
-      <w:pPr>
-        <w:spacing w:after="0"/>
-        <w:ind w:left="720"/>
-      </w:pPr>
-      <w:r>
-        <w:tab/>
-      </w:r>
-      <w:r>
-        <w:tab/>
-        <w:t xml:space="preserve">int result = </w:t>
-      </w:r>
-      <w:proofErr w:type="spellStart"/>
-      <w:proofErr w:type="gramStart"/>
-      <w:r>
-        <w:t>str.compareTo</w:t>
-      </w:r>
-      <w:proofErr w:type="spellEnd"/>
-      <w:proofErr w:type="gramEnd"/>
-      <w:r>
-        <w:t>(str1);</w:t>
-      </w:r>
-    </w:p>
-    <w:p>
-      <w:pPr>
-        <w:spacing w:after="0"/>
-        <w:ind w:left="720"/>
-      </w:pPr>
-    </w:p>
-    <w:p>
-      <w:pPr>
-        <w:spacing w:after="0"/>
-        <w:ind w:left="720"/>
-      </w:pPr>
-      <w:r>
-        <w:tab/>
-      </w:r>
-      <w:r>
-        <w:tab/>
-        <w:t>if (result == 0) {</w:t>
-      </w:r>
-    </w:p>
-    <w:p>
-      <w:pPr>
-        <w:spacing w:after="0"/>
-        <w:ind w:left="720"/>
-      </w:pPr>
-      <w:r>
-        <w:tab/>
-      </w:r>
-      <w:r>
-        <w:tab/>
-      </w:r>
-      <w:r>
-        <w:tab/>
-      </w:r>
-      <w:proofErr w:type="spellStart"/>
-      <w:r>
-        <w:t>System.out.println</w:t>
-      </w:r>
-      <w:proofErr w:type="spellEnd"/>
-      <w:r>
-        <w:t xml:space="preserve">("str and str1 are equal using </w:t>
-      </w:r>
-      <w:proofErr w:type="spellStart"/>
-      <w:proofErr w:type="gramStart"/>
-      <w:r>
-        <w:t>compareTo</w:t>
-      </w:r>
-      <w:proofErr w:type="spellEnd"/>
-      <w:r>
-        <w:t>(</w:t>
-      </w:r>
-      <w:proofErr w:type="gramEnd"/>
-      <w:r>
-        <w:t>)");</w:t>
-      </w:r>
-    </w:p>
-    <w:p>
-      <w:pPr>
-        <w:spacing w:after="0"/>
-        <w:ind w:left="720"/>
-      </w:pPr>
-      <w:r>
+        <w:lastRenderedPageBreak/>
         <w:tab/>
       </w:r>
       <w:r>
@@ -761,7 +752,6 @@
         <w:ind w:left="720"/>
       </w:pPr>
       <w:r>
-        <w:lastRenderedPageBreak/>
         <w:tab/>
       </w:r>
       <w:r>
@@ -1173,6 +1163,3127 @@
     <w:p>
       <w:pPr>
         <w:spacing w:after="0"/>
+        <w:rPr>
+          <w:b/>
+          <w:bCs/>
+          <w:sz w:val="32"/>
+          <w:szCs w:val="32"/>
+        </w:rPr>
+      </w:pPr>
+    </w:p>
+    <w:p>
+      <w:pPr>
+        <w:spacing w:after="0"/>
+        <w:rPr>
+          <w:b/>
+          <w:bCs/>
+          <w:sz w:val="32"/>
+          <w:szCs w:val="32"/>
+        </w:rPr>
+      </w:pPr>
+    </w:p>
+    <w:p>
+      <w:pPr>
+        <w:spacing w:after="0"/>
+        <w:rPr>
+          <w:b/>
+          <w:bCs/>
+          <w:sz w:val="32"/>
+          <w:szCs w:val="32"/>
+        </w:rPr>
+      </w:pPr>
+    </w:p>
+    <w:p>
+      <w:pPr>
+        <w:spacing w:after="0"/>
+        <w:rPr>
+          <w:b/>
+          <w:bCs/>
+          <w:sz w:val="32"/>
+          <w:szCs w:val="32"/>
+        </w:rPr>
+      </w:pPr>
+    </w:p>
+    <w:p>
+      <w:pPr>
+        <w:spacing w:after="0"/>
+        <w:rPr>
+          <w:b/>
+          <w:bCs/>
+          <w:sz w:val="32"/>
+          <w:szCs w:val="32"/>
+        </w:rPr>
+      </w:pPr>
+    </w:p>
+    <w:p>
+      <w:pPr>
+        <w:spacing w:after="0"/>
+        <w:rPr>
+          <w:b/>
+          <w:bCs/>
+          <w:sz w:val="32"/>
+          <w:szCs w:val="32"/>
+        </w:rPr>
+      </w:pPr>
+    </w:p>
+    <w:p>
+      <w:pPr>
+        <w:spacing w:after="0"/>
+        <w:rPr>
+          <w:b/>
+          <w:bCs/>
+          <w:sz w:val="32"/>
+          <w:szCs w:val="32"/>
+        </w:rPr>
+      </w:pPr>
+    </w:p>
+    <w:p>
+      <w:pPr>
+        <w:spacing w:after="0"/>
+        <w:rPr>
+          <w:b/>
+          <w:bCs/>
+          <w:sz w:val="32"/>
+          <w:szCs w:val="32"/>
+        </w:rPr>
+      </w:pPr>
+    </w:p>
+    <w:p>
+      <w:pPr>
+        <w:spacing w:after="0"/>
+        <w:rPr>
+          <w:b/>
+          <w:bCs/>
+          <w:sz w:val="32"/>
+          <w:szCs w:val="32"/>
+        </w:rPr>
+      </w:pPr>
+    </w:p>
+    <w:p>
+      <w:pPr>
+        <w:spacing w:after="0"/>
+        <w:rPr>
+          <w:b/>
+          <w:bCs/>
+          <w:sz w:val="28"/>
+          <w:szCs w:val="28"/>
+        </w:rPr>
+      </w:pPr>
+      <w:r>
+        <w:rPr>
+          <w:b/>
+          <w:bCs/>
+          <w:sz w:val="28"/>
+          <w:szCs w:val="28"/>
+        </w:rPr>
+        <w:t>Program 2:  Program to encode characters to their Unicode representations and decode them back.</w:t>
+      </w:r>
+    </w:p>
+    <w:p>
+      <w:pPr>
+        <w:spacing w:after="0"/>
+        <w:rPr>
+          <w:b/>
+          <w:bCs/>
+        </w:rPr>
+      </w:pPr>
+    </w:p>
+    <w:p>
+      <w:pPr>
+        <w:spacing w:after="0"/>
+        <w:ind w:left="720"/>
+      </w:pPr>
+      <w:r>
+        <w:t>package plo1;</w:t>
+      </w:r>
+    </w:p>
+    <w:p>
+      <w:pPr>
+        <w:spacing w:after="0"/>
+        <w:ind w:left="720"/>
+      </w:pPr>
+    </w:p>
+    <w:p>
+      <w:pPr>
+        <w:spacing w:after="0"/>
+        <w:ind w:left="720"/>
+      </w:pPr>
+      <w:r>
+        <w:t xml:space="preserve">import </w:t>
+      </w:r>
+      <w:proofErr w:type="spellStart"/>
+      <w:proofErr w:type="gramStart"/>
+      <w:r>
+        <w:t>java.nio.charset</w:t>
+      </w:r>
+      <w:proofErr w:type="gramEnd"/>
+      <w:r>
+        <w:t>.StandardCharsets</w:t>
+      </w:r>
+      <w:proofErr w:type="spellEnd"/>
+      <w:r>
+        <w:t>;</w:t>
+      </w:r>
+    </w:p>
+    <w:p>
+      <w:pPr>
+        <w:spacing w:after="0"/>
+        <w:ind w:left="720"/>
+      </w:pPr>
+      <w:r>
+        <w:t xml:space="preserve">import </w:t>
+      </w:r>
+      <w:proofErr w:type="spellStart"/>
+      <w:proofErr w:type="gramStart"/>
+      <w:r>
+        <w:t>java.util</w:t>
+      </w:r>
+      <w:proofErr w:type="gramEnd"/>
+      <w:r>
+        <w:t>.Scanner</w:t>
+      </w:r>
+      <w:proofErr w:type="spellEnd"/>
+      <w:r>
+        <w:t>;</w:t>
+      </w:r>
+    </w:p>
+    <w:p>
+      <w:pPr>
+        <w:spacing w:after="0"/>
+        <w:ind w:left="720"/>
+      </w:pPr>
+    </w:p>
+    <w:p>
+      <w:pPr>
+        <w:spacing w:after="0"/>
+        <w:ind w:left="720"/>
+      </w:pPr>
+      <w:r>
+        <w:t>public class Program2 {</w:t>
+      </w:r>
+    </w:p>
+    <w:p>
+      <w:pPr>
+        <w:spacing w:after="0"/>
+        <w:ind w:left="720"/>
+      </w:pPr>
+    </w:p>
+    <w:p>
+      <w:pPr>
+        <w:spacing w:after="0"/>
+        <w:ind w:left="720"/>
+      </w:pPr>
+      <w:r>
+        <w:tab/>
+        <w:t xml:space="preserve">public static void </w:t>
+      </w:r>
+      <w:proofErr w:type="gramStart"/>
+      <w:r>
+        <w:t>main(</w:t>
+      </w:r>
+      <w:proofErr w:type="gramEnd"/>
+      <w:r>
+        <w:t xml:space="preserve">String[] </w:t>
+      </w:r>
+      <w:proofErr w:type="spellStart"/>
+      <w:r>
+        <w:t>args</w:t>
+      </w:r>
+      <w:proofErr w:type="spellEnd"/>
+      <w:r>
+        <w:t>) {</w:t>
+      </w:r>
+    </w:p>
+    <w:p>
+      <w:pPr>
+        <w:spacing w:after="0"/>
+        <w:ind w:left="720"/>
+      </w:pPr>
+      <w:r>
+        <w:tab/>
+      </w:r>
+      <w:r>
+        <w:tab/>
+        <w:t>// TODO Auto-generated method stub</w:t>
+      </w:r>
+    </w:p>
+    <w:p>
+      <w:pPr>
+        <w:spacing w:after="0"/>
+        <w:ind w:left="720"/>
+      </w:pPr>
+      <w:r>
+        <w:tab/>
+      </w:r>
+      <w:r>
+        <w:tab/>
+        <w:t xml:space="preserve">Scanner </w:t>
+      </w:r>
+      <w:proofErr w:type="spellStart"/>
+      <w:r>
+        <w:t>scanner</w:t>
+      </w:r>
+      <w:proofErr w:type="spellEnd"/>
+      <w:r>
+        <w:t xml:space="preserve"> = new </w:t>
+      </w:r>
+      <w:proofErr w:type="gramStart"/>
+      <w:r>
+        <w:t>Scanner(</w:t>
+      </w:r>
+      <w:proofErr w:type="gramEnd"/>
+      <w:r>
+        <w:t>System.in);</w:t>
+      </w:r>
+    </w:p>
+    <w:p>
+      <w:pPr>
+        <w:spacing w:after="0"/>
+        <w:ind w:left="720"/>
+      </w:pPr>
+      <w:r>
+        <w:tab/>
+      </w:r>
+      <w:r>
+        <w:tab/>
+      </w:r>
+      <w:proofErr w:type="spellStart"/>
+      <w:r>
+        <w:t>System.out.println</w:t>
+      </w:r>
+      <w:proofErr w:type="spellEnd"/>
+      <w:r>
+        <w:t>("Program 2:");</w:t>
+      </w:r>
+    </w:p>
+    <w:p>
+      <w:pPr>
+        <w:spacing w:after="0"/>
+        <w:ind w:left="720"/>
+      </w:pPr>
+    </w:p>
+    <w:p>
+      <w:pPr>
+        <w:spacing w:after="0"/>
+        <w:ind w:left="720"/>
+      </w:pPr>
+      <w:r>
+        <w:t>// INPUT A STRING FROM THE USER</w:t>
+      </w:r>
+    </w:p>
+    <w:p>
+      <w:pPr>
+        <w:spacing w:after="0"/>
+        <w:ind w:left="720"/>
+      </w:pPr>
+      <w:r>
+        <w:tab/>
+      </w:r>
+      <w:r>
+        <w:tab/>
+      </w:r>
+      <w:proofErr w:type="spellStart"/>
+      <w:r>
+        <w:t>System.out.println</w:t>
+      </w:r>
+      <w:proofErr w:type="spellEnd"/>
+      <w:r>
+        <w:t>("Enter a string:");</w:t>
+      </w:r>
+    </w:p>
+    <w:p>
+      <w:pPr>
+        <w:spacing w:after="0"/>
+        <w:ind w:left="720"/>
+      </w:pPr>
+      <w:r>
+        <w:tab/>
+      </w:r>
+      <w:r>
+        <w:tab/>
+        <w:t xml:space="preserve">String </w:t>
+      </w:r>
+      <w:proofErr w:type="spellStart"/>
+      <w:r>
+        <w:t>string</w:t>
+      </w:r>
+      <w:proofErr w:type="spellEnd"/>
+      <w:r>
+        <w:t xml:space="preserve"> = </w:t>
+      </w:r>
+      <w:proofErr w:type="spellStart"/>
+      <w:proofErr w:type="gramStart"/>
+      <w:r>
+        <w:t>scanner.nextLine</w:t>
+      </w:r>
+      <w:proofErr w:type="spellEnd"/>
+      <w:proofErr w:type="gramEnd"/>
+      <w:r>
+        <w:t>();</w:t>
+      </w:r>
+    </w:p>
+    <w:p>
+      <w:pPr>
+        <w:spacing w:after="0"/>
+        <w:ind w:left="720"/>
+      </w:pPr>
+    </w:p>
+    <w:p>
+      <w:pPr>
+        <w:spacing w:after="0"/>
+        <w:ind w:left="720"/>
+      </w:pPr>
+      <w:r>
+        <w:t>// CONVERT THE STRING TO UNICODE CODE POINTS</w:t>
+      </w:r>
+    </w:p>
+    <w:p>
+      <w:pPr>
+        <w:spacing w:after="0"/>
+        <w:ind w:left="720"/>
+      </w:pPr>
+      <w:r>
+        <w:tab/>
+      </w:r>
+      <w:r>
+        <w:tab/>
+      </w:r>
+      <w:proofErr w:type="spellStart"/>
+      <w:r>
+        <w:t>System.out.println</w:t>
+      </w:r>
+      <w:proofErr w:type="spellEnd"/>
+      <w:r>
+        <w:t>("\</w:t>
+      </w:r>
+      <w:proofErr w:type="spellStart"/>
+      <w:r>
+        <w:t>nUnicode</w:t>
+      </w:r>
+      <w:proofErr w:type="spellEnd"/>
+      <w:r>
+        <w:t xml:space="preserve"> code points for the input string: " + string);</w:t>
+      </w:r>
+    </w:p>
+    <w:p>
+      <w:pPr>
+        <w:spacing w:after="0"/>
+        <w:ind w:left="720"/>
+      </w:pPr>
+    </w:p>
+    <w:p>
+      <w:pPr>
+        <w:spacing w:after="0"/>
+        <w:ind w:left="720"/>
+      </w:pPr>
+      <w:r>
+        <w:tab/>
+      </w:r>
+      <w:r>
+        <w:tab/>
+        <w:t xml:space="preserve">for (int x = 0; x &lt; </w:t>
+      </w:r>
+      <w:proofErr w:type="spellStart"/>
+      <w:proofErr w:type="gramStart"/>
+      <w:r>
+        <w:t>string.length</w:t>
+      </w:r>
+      <w:proofErr w:type="spellEnd"/>
+      <w:proofErr w:type="gramEnd"/>
+      <w:r>
+        <w:t>(); x++) {</w:t>
+      </w:r>
+    </w:p>
+    <w:p>
+      <w:pPr>
+        <w:spacing w:after="0"/>
+        <w:ind w:left="720"/>
+      </w:pPr>
+    </w:p>
+    <w:p>
+      <w:pPr>
+        <w:spacing w:after="0"/>
+        <w:ind w:left="720"/>
+      </w:pPr>
+      <w:r>
+        <w:t>// GET UNICODE CODE POINT</w:t>
+      </w:r>
+    </w:p>
+    <w:p>
+      <w:pPr>
+        <w:spacing w:after="0"/>
+        <w:ind w:left="720"/>
+      </w:pPr>
+      <w:r>
+        <w:tab/>
+      </w:r>
+      <w:r>
+        <w:tab/>
+      </w:r>
+      <w:r>
+        <w:tab/>
+        <w:t xml:space="preserve">int cp = </w:t>
+      </w:r>
+      <w:proofErr w:type="spellStart"/>
+      <w:proofErr w:type="gramStart"/>
+      <w:r>
+        <w:t>string.codePointAt</w:t>
+      </w:r>
+      <w:proofErr w:type="spellEnd"/>
+      <w:proofErr w:type="gramEnd"/>
+      <w:r>
+        <w:t>(x);</w:t>
+      </w:r>
+    </w:p>
+    <w:p>
+      <w:pPr>
+        <w:spacing w:after="0"/>
+        <w:ind w:left="720"/>
+      </w:pPr>
+      <w:r>
+        <w:tab/>
+      </w:r>
+      <w:r>
+        <w:tab/>
+      </w:r>
+      <w:r>
+        <w:tab/>
+      </w:r>
+      <w:proofErr w:type="spellStart"/>
+      <w:r>
+        <w:t>System.out.printf</w:t>
+      </w:r>
+      <w:proofErr w:type="spellEnd"/>
+      <w:r>
+        <w:t xml:space="preserve">("Character: '%c' -&gt; Unicode: \\u%04X\n", </w:t>
+      </w:r>
+      <w:proofErr w:type="spellStart"/>
+      <w:proofErr w:type="gramStart"/>
+      <w:r>
+        <w:t>string.charAt</w:t>
+      </w:r>
+      <w:proofErr w:type="spellEnd"/>
+      <w:proofErr w:type="gramEnd"/>
+      <w:r>
+        <w:t>(x), cp);</w:t>
+      </w:r>
+    </w:p>
+    <w:p>
+      <w:pPr>
+        <w:spacing w:after="0"/>
+        <w:ind w:left="720"/>
+      </w:pPr>
+      <w:r>
+        <w:tab/>
+      </w:r>
+      <w:r>
+        <w:tab/>
+        <w:t>}</w:t>
+      </w:r>
+    </w:p>
+    <w:p>
+      <w:pPr>
+        <w:spacing w:after="0"/>
+        <w:ind w:left="720"/>
+      </w:pPr>
+    </w:p>
+    <w:p>
+      <w:pPr>
+        <w:spacing w:after="0"/>
+        <w:ind w:left="720"/>
+      </w:pPr>
+      <w:r>
+        <w:t>// CONVERT THE STRING TO BYTES USING UTF-8 ENCODING</w:t>
+      </w:r>
+    </w:p>
+    <w:p>
+      <w:pPr>
+        <w:spacing w:after="0"/>
+        <w:ind w:left="720"/>
+      </w:pPr>
+      <w:r>
+        <w:tab/>
+      </w:r>
+      <w:r>
+        <w:tab/>
+      </w:r>
+      <w:proofErr w:type="gramStart"/>
+      <w:r>
+        <w:t>byte[</w:t>
+      </w:r>
+      <w:proofErr w:type="gramEnd"/>
+      <w:r>
+        <w:t xml:space="preserve">] bytes = </w:t>
+      </w:r>
+      <w:proofErr w:type="spellStart"/>
+      <w:r>
+        <w:t>string.getBytes</w:t>
+      </w:r>
+      <w:proofErr w:type="spellEnd"/>
+      <w:r>
+        <w:t>(StandardCharsets.UTF_8);</w:t>
+      </w:r>
+    </w:p>
+    <w:p>
+      <w:pPr>
+        <w:spacing w:after="0"/>
+        <w:ind w:left="720"/>
+      </w:pPr>
+      <w:r>
+        <w:tab/>
+      </w:r>
+      <w:r>
+        <w:tab/>
+      </w:r>
+      <w:proofErr w:type="spellStart"/>
+      <w:r>
+        <w:t>System.out.println</w:t>
+      </w:r>
+      <w:proofErr w:type="spellEnd"/>
+      <w:r>
+        <w:t>("\</w:t>
+      </w:r>
+      <w:proofErr w:type="spellStart"/>
+      <w:r>
+        <w:t>nString</w:t>
+      </w:r>
+      <w:proofErr w:type="spellEnd"/>
+      <w:r>
+        <w:t xml:space="preserve"> in UTF-8 byte encoding:");</w:t>
+      </w:r>
+    </w:p>
+    <w:p>
+      <w:pPr>
+        <w:spacing w:after="0"/>
+        <w:ind w:left="720"/>
+      </w:pPr>
+    </w:p>
+    <w:p>
+      <w:pPr>
+        <w:spacing w:after="0"/>
+        <w:ind w:left="720"/>
+      </w:pPr>
+      <w:r>
+        <w:tab/>
+      </w:r>
+      <w:r>
+        <w:tab/>
+        <w:t xml:space="preserve">for (byte </w:t>
+      </w:r>
+      <w:proofErr w:type="gramStart"/>
+      <w:r>
+        <w:t>b :</w:t>
+      </w:r>
+      <w:proofErr w:type="gramEnd"/>
+      <w:r>
+        <w:t xml:space="preserve"> bytes) {</w:t>
+      </w:r>
+    </w:p>
+    <w:p>
+      <w:pPr>
+        <w:spacing w:after="0"/>
+        <w:ind w:left="720"/>
+      </w:pPr>
+    </w:p>
+    <w:p>
+      <w:pPr>
+        <w:spacing w:after="0"/>
+        <w:ind w:left="720"/>
+      </w:pPr>
+      <w:r>
+        <w:t>// PRINT EACH BYTES IN HEXADECIMAL FORMAT</w:t>
+      </w:r>
+    </w:p>
+    <w:p>
+      <w:pPr>
+        <w:spacing w:after="0"/>
+        <w:ind w:left="720"/>
+      </w:pPr>
+      <w:r>
+        <w:tab/>
+      </w:r>
+      <w:r>
+        <w:tab/>
+      </w:r>
+      <w:r>
+        <w:tab/>
+      </w:r>
+      <w:proofErr w:type="spellStart"/>
+      <w:r>
+        <w:t>System.out.printf</w:t>
+      </w:r>
+      <w:proofErr w:type="spellEnd"/>
+      <w:r>
+        <w:t>("%02X ", b);</w:t>
+      </w:r>
+    </w:p>
+    <w:p>
+      <w:pPr>
+        <w:spacing w:after="0"/>
+        <w:ind w:left="720"/>
+      </w:pPr>
+      <w:r>
+        <w:tab/>
+      </w:r>
+      <w:r>
+        <w:tab/>
+        <w:t>}</w:t>
+      </w:r>
+    </w:p>
+    <w:p>
+      <w:pPr>
+        <w:spacing w:after="0"/>
+        <w:ind w:left="720"/>
+      </w:pPr>
+    </w:p>
+    <w:p>
+      <w:pPr>
+        <w:spacing w:after="0"/>
+        <w:ind w:left="720"/>
+      </w:pPr>
+      <w:r>
+        <w:t>// DECODE THE BYTES BACK TO THE ORIGINAL STRING</w:t>
+      </w:r>
+    </w:p>
+    <w:p>
+      <w:pPr>
+        <w:spacing w:after="0"/>
+        <w:ind w:left="720"/>
+      </w:pPr>
+      <w:r>
+        <w:tab/>
+      </w:r>
+      <w:r>
+        <w:tab/>
+        <w:t xml:space="preserve">String </w:t>
+      </w:r>
+      <w:proofErr w:type="spellStart"/>
+      <w:r>
+        <w:t>decodedStr</w:t>
+      </w:r>
+      <w:proofErr w:type="spellEnd"/>
+      <w:r>
+        <w:t xml:space="preserve"> = new </w:t>
+      </w:r>
+      <w:proofErr w:type="gramStart"/>
+      <w:r>
+        <w:t>String(</w:t>
+      </w:r>
+      <w:proofErr w:type="gramEnd"/>
+      <w:r>
+        <w:t>bytes, StandardCharsets.UTF_8);</w:t>
+      </w:r>
+    </w:p>
+    <w:p>
+      <w:pPr>
+        <w:spacing w:after="0"/>
+        <w:ind w:left="720"/>
+      </w:pPr>
+      <w:r>
+        <w:tab/>
+      </w:r>
+      <w:r>
+        <w:tab/>
+      </w:r>
+      <w:proofErr w:type="spellStart"/>
+      <w:r>
+        <w:t>System.out.println</w:t>
+      </w:r>
+      <w:proofErr w:type="spellEnd"/>
+      <w:r>
+        <w:t>("\n\</w:t>
+      </w:r>
+      <w:proofErr w:type="spellStart"/>
+      <w:r>
+        <w:t>nDecoded</w:t>
+      </w:r>
+      <w:proofErr w:type="spellEnd"/>
+      <w:r>
+        <w:t xml:space="preserve"> string from UTF-8 Bytes: " + </w:t>
+      </w:r>
+      <w:proofErr w:type="spellStart"/>
+      <w:r>
+        <w:t>decodedStr</w:t>
+      </w:r>
+      <w:proofErr w:type="spellEnd"/>
+      <w:r>
+        <w:t>);</w:t>
+      </w:r>
+    </w:p>
+    <w:p>
+      <w:pPr>
+        <w:spacing w:after="0"/>
+        <w:ind w:left="720"/>
+      </w:pPr>
+      <w:r>
+        <w:tab/>
+      </w:r>
+      <w:r>
+        <w:tab/>
+      </w:r>
+      <w:proofErr w:type="spellStart"/>
+      <w:proofErr w:type="gramStart"/>
+      <w:r>
+        <w:t>scanner.close</w:t>
+      </w:r>
+      <w:proofErr w:type="spellEnd"/>
+      <w:proofErr w:type="gramEnd"/>
+      <w:r>
+        <w:t>();</w:t>
+      </w:r>
+    </w:p>
+    <w:p>
+      <w:pPr>
+        <w:spacing w:after="0"/>
+        <w:ind w:left="720"/>
+      </w:pPr>
+      <w:r>
+        <w:lastRenderedPageBreak/>
+        <w:tab/>
+        <w:t>}</w:t>
+      </w:r>
+    </w:p>
+    <w:p>
+      <w:pPr>
+        <w:spacing w:after="0"/>
+      </w:pPr>
+      <w:r>
+        <w:t>}</w:t>
+      </w:r>
+    </w:p>
+    <w:p>
+      <w:pPr>
+        <w:spacing w:after="0"/>
+      </w:pPr>
+    </w:p>
+    <w:p>
+      <w:pPr>
+        <w:spacing w:after="0"/>
+      </w:pPr>
+    </w:p>
+    <w:p>
+      <w:pPr>
+        <w:spacing w:after="0"/>
+        <w:rPr>
+          <w:b/>
+          <w:bCs/>
+          <w:sz w:val="28"/>
+          <w:szCs w:val="28"/>
+        </w:rPr>
+      </w:pPr>
+      <w:r>
+        <w:rPr>
+          <w:b/>
+          <w:bCs/>
+          <w:sz w:val="28"/>
+          <w:szCs w:val="28"/>
+        </w:rPr>
+        <w:t>Output:</w:t>
+      </w:r>
+    </w:p>
+    <w:p>
+      <w:pPr>
+        <w:spacing w:after="0"/>
+      </w:pPr>
+    </w:p>
+    <w:p>
+      <w:pPr>
+        <w:spacing w:after="0"/>
+      </w:pPr>
+      <w:r>
+        <w:drawing>
+          <wp:inline distT="0" distB="0" distL="0" distR="0" wp14:anchorId="3D7C1648" wp14:editId="47A34373">
+            <wp:extent cx="4343400" cy="2771775"/>
+            <wp:effectExtent l="0" t="0" r="0" b="9525"/>
+            <wp:docPr id="1" name="Picture 1"/>
+            <wp:cNvGraphicFramePr>
+              <a:graphicFrameLocks xmlns:a="http://schemas.openxmlformats.org/drawingml/2006/main" noChangeAspect="1"/>
+            </wp:cNvGraphicFramePr>
+            <a:graphic xmlns:a="http://schemas.openxmlformats.org/drawingml/2006/main">
+              <a:graphicData uri="http://schemas.openxmlformats.org/drawingml/2006/picture">
+                <pic:pic xmlns:pic="http://schemas.openxmlformats.org/drawingml/2006/picture">
+                  <pic:nvPicPr>
+                    <pic:cNvPr id="1" name=""/>
+                    <pic:cNvPicPr/>
+                  </pic:nvPicPr>
+                  <pic:blipFill>
+                    <a:blip r:embed="rId5"/>
+                    <a:stretch>
+                      <a:fillRect/>
+                    </a:stretch>
+                  </pic:blipFill>
+                  <pic:spPr>
+                    <a:xfrm>
+                      <a:off x="0" y="0"/>
+                      <a:ext cx="4356499" cy="2780134"/>
+                    </a:xfrm>
+                    <a:prstGeom prst="rect">
+                      <a:avLst/>
+                    </a:prstGeom>
+                  </pic:spPr>
+                </pic:pic>
+              </a:graphicData>
+            </a:graphic>
+          </wp:inline>
+        </w:drawing>
+      </w:r>
+    </w:p>
+    <w:p>
+      <w:pPr>
+        <w:spacing w:after="0"/>
+      </w:pPr>
+    </w:p>
+    <w:p>
+      <w:pPr>
+        <w:spacing w:after="0"/>
+      </w:pPr>
+    </w:p>
+    <w:p>
+      <w:pPr>
+        <w:spacing w:after="0"/>
+      </w:pPr>
+    </w:p>
+    <w:p>
+      <w:pPr>
+        <w:spacing w:after="0"/>
+      </w:pPr>
+    </w:p>
+    <w:p>
+      <w:pPr>
+        <w:spacing w:after="0"/>
+      </w:pPr>
+    </w:p>
+    <w:p>
+      <w:pPr>
+        <w:spacing w:after="0"/>
+      </w:pPr>
+    </w:p>
+    <w:p>
+      <w:pPr>
+        <w:spacing w:after="0"/>
+      </w:pPr>
+    </w:p>
+    <w:p>
+      <w:pPr>
+        <w:spacing w:after="0"/>
+      </w:pPr>
+    </w:p>
+    <w:p>
+      <w:pPr>
+        <w:spacing w:after="0"/>
+      </w:pPr>
+    </w:p>
+    <w:p>
+      <w:pPr>
+        <w:spacing w:after="0"/>
+      </w:pPr>
+    </w:p>
+    <w:p>
+      <w:pPr>
+        <w:spacing w:after="0"/>
+      </w:pPr>
+    </w:p>
+    <w:p>
+      <w:pPr>
+        <w:spacing w:after="0"/>
+      </w:pPr>
+    </w:p>
+    <w:p>
+      <w:pPr>
+        <w:spacing w:after="0"/>
+      </w:pPr>
+    </w:p>
+    <w:p>
+      <w:pPr>
+        <w:spacing w:after="0"/>
+      </w:pPr>
+    </w:p>
+    <w:p>
+      <w:pPr>
+        <w:spacing w:after="0"/>
+      </w:pPr>
+    </w:p>
+    <w:p>
+      <w:pPr>
+        <w:spacing w:after="0"/>
+      </w:pPr>
+    </w:p>
+    <w:p>
+      <w:pPr>
+        <w:spacing w:after="0"/>
+      </w:pPr>
+    </w:p>
+    <w:p>
+      <w:pPr>
+        <w:spacing w:after="0"/>
+      </w:pPr>
+    </w:p>
+    <w:p>
+      <w:pPr>
+        <w:spacing w:after="0"/>
+      </w:pPr>
+    </w:p>
+    <w:p>
+      <w:pPr>
+        <w:spacing w:after="0"/>
+      </w:pPr>
+    </w:p>
+    <w:p>
+      <w:pPr>
+        <w:spacing w:after="0"/>
+      </w:pPr>
+    </w:p>
+    <w:p>
+      <w:pPr>
+        <w:spacing w:after="0"/>
+      </w:pPr>
+    </w:p>
+    <w:p>
+      <w:pPr>
+        <w:spacing w:after="0"/>
+      </w:pPr>
+    </w:p>
+    <w:p>
+      <w:pPr>
+        <w:spacing w:after="0"/>
+      </w:pPr>
+    </w:p>
+    <w:p>
+      <w:pPr>
+        <w:spacing w:after="0"/>
+      </w:pPr>
+    </w:p>
+    <w:p>
+      <w:pPr>
+        <w:spacing w:after="0"/>
+      </w:pPr>
+    </w:p>
+    <w:p>
+      <w:pPr>
+        <w:spacing w:after="0"/>
+      </w:pPr>
+    </w:p>
+    <w:p>
+      <w:pPr>
+        <w:spacing w:after="0"/>
+      </w:pPr>
+    </w:p>
+    <w:p>
+      <w:pPr>
+        <w:spacing w:after="0"/>
+      </w:pPr>
+    </w:p>
+    <w:p>
+      <w:pPr>
+        <w:spacing w:after="0"/>
+      </w:pPr>
+    </w:p>
+    <w:p>
+      <w:pPr>
+        <w:spacing w:after="0"/>
+        <w:rPr>
+          <w:b/>
+          <w:bCs/>
+          <w:sz w:val="28"/>
+          <w:szCs w:val="28"/>
+        </w:rPr>
+      </w:pPr>
+      <w:r>
+        <w:rPr>
+          <w:b/>
+          <w:bCs/>
+          <w:sz w:val="28"/>
+          <w:szCs w:val="28"/>
+        </w:rPr>
+        <w:t>Program 3:  Write a program that takes user input for multiple strings and appends them using StringBuilder.</w:t>
+      </w:r>
+    </w:p>
+    <w:p>
+      <w:pPr>
+        <w:spacing w:after="0"/>
+        <w:rPr>
+          <w:b/>
+          <w:bCs/>
+          <w:sz w:val="28"/>
+          <w:szCs w:val="28"/>
+        </w:rPr>
+      </w:pPr>
+    </w:p>
+    <w:p>
+      <w:pPr>
+        <w:spacing w:after="0"/>
+        <w:ind w:left="720"/>
+      </w:pPr>
+      <w:r>
+        <w:t>package plo1;</w:t>
+      </w:r>
+    </w:p>
+    <w:p>
+      <w:pPr>
+        <w:spacing w:after="0"/>
+        <w:ind w:left="720"/>
+      </w:pPr>
+    </w:p>
+    <w:p>
+      <w:pPr>
+        <w:spacing w:after="0"/>
+        <w:ind w:left="720"/>
+      </w:pPr>
+      <w:r>
+        <w:t xml:space="preserve">import </w:t>
+      </w:r>
+      <w:proofErr w:type="spellStart"/>
+      <w:proofErr w:type="gramStart"/>
+      <w:r>
+        <w:t>java.util</w:t>
+      </w:r>
+      <w:proofErr w:type="gramEnd"/>
+      <w:r>
+        <w:t>.Scanner</w:t>
+      </w:r>
+      <w:proofErr w:type="spellEnd"/>
+      <w:r>
+        <w:t>;</w:t>
+      </w:r>
+    </w:p>
+    <w:p>
+      <w:pPr>
+        <w:spacing w:after="0"/>
+        <w:ind w:left="720"/>
+      </w:pPr>
+    </w:p>
+    <w:p>
+      <w:pPr>
+        <w:spacing w:after="0"/>
+        <w:ind w:left="720"/>
+      </w:pPr>
+      <w:r>
+        <w:t>public class Program3 {</w:t>
+      </w:r>
+    </w:p>
+    <w:p>
+      <w:pPr>
+        <w:spacing w:after="0"/>
+        <w:ind w:left="720"/>
+      </w:pPr>
+      <w:r>
+        <w:tab/>
+        <w:t xml:space="preserve">public static void </w:t>
+      </w:r>
+      <w:proofErr w:type="gramStart"/>
+      <w:r>
+        <w:t>main(</w:t>
+      </w:r>
+      <w:proofErr w:type="gramEnd"/>
+      <w:r>
+        <w:t xml:space="preserve">String[] </w:t>
+      </w:r>
+      <w:proofErr w:type="spellStart"/>
+      <w:r>
+        <w:t>args</w:t>
+      </w:r>
+      <w:proofErr w:type="spellEnd"/>
+      <w:r>
+        <w:t>) {</w:t>
+      </w:r>
+      <w:r>
+        <w:tab/>
+      </w:r>
+      <w:r>
+        <w:tab/>
+      </w:r>
+    </w:p>
+    <w:p>
+      <w:pPr>
+        <w:spacing w:after="0"/>
+        <w:ind w:left="720"/>
+      </w:pPr>
+      <w:r>
+        <w:tab/>
+      </w:r>
+      <w:proofErr w:type="spellStart"/>
+      <w:r>
+        <w:t>System.</w:t>
+      </w:r>
+      <w:r>
+        <w:rPr>
+          <w:i/>
+          <w:iCs/>
+        </w:rPr>
+        <w:t>out</w:t>
+      </w:r>
+      <w:r>
+        <w:t>.</w:t>
+      </w:r>
+      <w:r>
+        <w:rPr>
+          <w:u w:val="single"/>
+        </w:rPr>
+        <w:t>println</w:t>
+      </w:r>
+      <w:proofErr w:type="spellEnd"/>
+      <w:r>
+        <w:t>("Program 3:");</w:t>
+      </w:r>
+    </w:p>
+    <w:p>
+      <w:pPr>
+        <w:spacing w:after="0"/>
+        <w:ind w:left="720"/>
+      </w:pPr>
+    </w:p>
+    <w:p>
+      <w:pPr>
+        <w:spacing w:after="0"/>
+        <w:ind w:left="720"/>
+      </w:pPr>
+      <w:r>
+        <w:tab/>
+        <w:t xml:space="preserve">Scanner </w:t>
+      </w:r>
+      <w:proofErr w:type="spellStart"/>
+      <w:r>
+        <w:t>scanner</w:t>
+      </w:r>
+      <w:proofErr w:type="spellEnd"/>
+      <w:r>
+        <w:t xml:space="preserve"> = new </w:t>
+      </w:r>
+      <w:proofErr w:type="gramStart"/>
+      <w:r>
+        <w:t>Scanner(</w:t>
+      </w:r>
+      <w:proofErr w:type="gramEnd"/>
+      <w:r>
+        <w:t>System.</w:t>
+      </w:r>
+      <w:r>
+        <w:rPr>
+          <w:i/>
+          <w:iCs/>
+        </w:rPr>
+        <w:t>in</w:t>
+      </w:r>
+      <w:r>
+        <w:t>);</w:t>
+      </w:r>
+    </w:p>
+    <w:p>
+      <w:pPr>
+        <w:spacing w:after="0"/>
+        <w:ind w:left="720"/>
+      </w:pPr>
+      <w:r>
+        <w:tab/>
+      </w:r>
+    </w:p>
+    <w:p>
+      <w:pPr>
+        <w:spacing w:after="0"/>
+        <w:ind w:left="720"/>
+      </w:pPr>
+      <w:r>
+        <w:tab/>
+        <w:t xml:space="preserve">StringBuilder sb = new </w:t>
+      </w:r>
+      <w:proofErr w:type="gramStart"/>
+      <w:r>
+        <w:t>StringBuilder(</w:t>
+      </w:r>
+      <w:proofErr w:type="gramEnd"/>
+      <w:r>
+        <w:t>);</w:t>
+      </w:r>
+    </w:p>
+    <w:p>
+      <w:pPr>
+        <w:spacing w:after="0"/>
+        <w:ind w:left="720"/>
+      </w:pPr>
+      <w:r>
+        <w:tab/>
+      </w:r>
+    </w:p>
+    <w:p>
+      <w:pPr>
+        <w:spacing w:after="0"/>
+        <w:ind w:left="720"/>
+      </w:pPr>
+      <w:r>
+        <w:tab/>
+      </w:r>
+      <w:proofErr w:type="spellStart"/>
+      <w:r>
+        <w:t>System.</w:t>
+      </w:r>
+      <w:r>
+        <w:rPr>
+          <w:i/>
+          <w:iCs/>
+        </w:rPr>
+        <w:t>out</w:t>
+      </w:r>
+      <w:r>
+        <w:t>.println</w:t>
+      </w:r>
+      <w:proofErr w:type="spellEnd"/>
+      <w:r>
+        <w:t>("Enter strings to concatenate (Type exit to stop):");</w:t>
+      </w:r>
+    </w:p>
+    <w:p>
+      <w:pPr>
+        <w:spacing w:after="0"/>
+        <w:ind w:left="720"/>
+      </w:pPr>
+      <w:r>
+        <w:tab/>
+      </w:r>
+    </w:p>
+    <w:p>
+      <w:pPr>
+        <w:spacing w:after="0"/>
+        <w:ind w:left="720"/>
+      </w:pPr>
+      <w:r>
+        <w:tab/>
+        <w:t>while (true) {</w:t>
+      </w:r>
+    </w:p>
+    <w:p>
+      <w:pPr>
+        <w:spacing w:after="0"/>
+        <w:ind w:left="720"/>
+      </w:pPr>
+      <w:r>
+        <w:tab/>
+      </w:r>
+      <w:r>
+        <w:tab/>
+        <w:t xml:space="preserve">String </w:t>
+      </w:r>
+      <w:proofErr w:type="spellStart"/>
+      <w:r>
+        <w:t>string</w:t>
+      </w:r>
+      <w:proofErr w:type="spellEnd"/>
+      <w:r>
+        <w:t xml:space="preserve"> = </w:t>
+      </w:r>
+      <w:proofErr w:type="spellStart"/>
+      <w:proofErr w:type="gramStart"/>
+      <w:r>
+        <w:t>scanner.nextLine</w:t>
+      </w:r>
+      <w:proofErr w:type="spellEnd"/>
+      <w:proofErr w:type="gramEnd"/>
+      <w:r>
+        <w:t>();</w:t>
+      </w:r>
+    </w:p>
+    <w:p>
+      <w:pPr>
+        <w:spacing w:after="0"/>
+        <w:ind w:left="720"/>
+      </w:pPr>
+      <w:r>
+        <w:tab/>
+      </w:r>
+      <w:r>
+        <w:tab/>
+      </w:r>
+    </w:p>
+    <w:p>
+      <w:pPr>
+        <w:spacing w:after="0"/>
+        <w:ind w:left="720"/>
+      </w:pPr>
+      <w:r>
+        <w:tab/>
+      </w:r>
+      <w:r>
+        <w:tab/>
+        <w:t>if (</w:t>
+      </w:r>
+      <w:proofErr w:type="spellStart"/>
+      <w:proofErr w:type="gramStart"/>
+      <w:r>
+        <w:t>string.equalsIgnoreCase</w:t>
+      </w:r>
+      <w:proofErr w:type="spellEnd"/>
+      <w:proofErr w:type="gramEnd"/>
+      <w:r>
+        <w:t>("exit")) {</w:t>
+      </w:r>
+    </w:p>
+    <w:p>
+      <w:pPr>
+        <w:spacing w:after="0"/>
+        <w:ind w:left="720"/>
+      </w:pPr>
+      <w:r>
+        <w:tab/>
+      </w:r>
+      <w:r>
+        <w:tab/>
+      </w:r>
+      <w:r>
+        <w:tab/>
+        <w:t>break;</w:t>
+      </w:r>
+    </w:p>
+    <w:p>
+      <w:pPr>
+        <w:spacing w:after="0"/>
+        <w:ind w:left="720"/>
+      </w:pPr>
+      <w:r>
+        <w:tab/>
+      </w:r>
+      <w:r>
+        <w:tab/>
+        <w:t>}</w:t>
+      </w:r>
+    </w:p>
+    <w:p>
+      <w:pPr>
+        <w:spacing w:after="0"/>
+        <w:ind w:left="720"/>
+      </w:pPr>
+      <w:r>
+        <w:tab/>
+      </w:r>
+      <w:r>
+        <w:tab/>
+      </w:r>
+      <w:proofErr w:type="spellStart"/>
+      <w:proofErr w:type="gramStart"/>
+      <w:r>
+        <w:t>sb.append</w:t>
+      </w:r>
+      <w:proofErr w:type="spellEnd"/>
+      <w:proofErr w:type="gramEnd"/>
+      <w:r>
+        <w:t>(</w:t>
+      </w:r>
+      <w:proofErr w:type="spellStart"/>
+      <w:r>
+        <w:t>string.trim</w:t>
+      </w:r>
+      <w:proofErr w:type="spellEnd"/>
+      <w:r>
+        <w:t>()).append(" ");</w:t>
+      </w:r>
+    </w:p>
+    <w:p>
+      <w:pPr>
+        <w:spacing w:after="0"/>
+        <w:ind w:left="720"/>
+      </w:pPr>
+      <w:r>
+        <w:tab/>
+        <w:t>}</w:t>
+      </w:r>
+    </w:p>
+    <w:p>
+      <w:pPr>
+        <w:spacing w:after="0"/>
+        <w:ind w:left="720"/>
+      </w:pPr>
+      <w:r>
+        <w:tab/>
+      </w:r>
+      <w:proofErr w:type="spellStart"/>
+      <w:r>
+        <w:t>System.</w:t>
+      </w:r>
+      <w:r>
+        <w:rPr>
+          <w:i/>
+          <w:iCs/>
+        </w:rPr>
+        <w:t>out</w:t>
+      </w:r>
+      <w:r>
+        <w:t>.println</w:t>
+      </w:r>
+      <w:proofErr w:type="spellEnd"/>
+      <w:r>
+        <w:t xml:space="preserve">("Concatenated result: "+ </w:t>
+      </w:r>
+      <w:proofErr w:type="spellStart"/>
+      <w:proofErr w:type="gramStart"/>
+      <w:r>
+        <w:t>sb.toString</w:t>
+      </w:r>
+      <w:proofErr w:type="spellEnd"/>
+      <w:proofErr w:type="gramEnd"/>
+      <w:r>
+        <w:t>().trim());</w:t>
+      </w:r>
+    </w:p>
+    <w:p>
+      <w:pPr>
+        <w:spacing w:after="0"/>
+        <w:ind w:left="720"/>
+      </w:pPr>
+      <w:r>
+        <w:tab/>
+      </w:r>
+      <w:proofErr w:type="spellStart"/>
+      <w:proofErr w:type="gramStart"/>
+      <w:r>
+        <w:t>scanner.close</w:t>
+      </w:r>
+      <w:proofErr w:type="spellEnd"/>
+      <w:proofErr w:type="gramEnd"/>
+      <w:r>
+        <w:t>();</w:t>
+      </w:r>
+    </w:p>
+    <w:p>
+      <w:pPr>
+        <w:spacing w:after="0"/>
+        <w:ind w:left="720"/>
+      </w:pPr>
+      <w:r>
+        <w:tab/>
+        <w:t>}</w:t>
+      </w:r>
+    </w:p>
+    <w:p>
+      <w:pPr>
+        <w:spacing w:after="0"/>
+        <w:ind w:left="720"/>
+      </w:pPr>
+      <w:r>
+        <w:t>}</w:t>
+      </w:r>
+    </w:p>
+    <w:p>
+      <w:pPr>
+        <w:spacing w:after="0"/>
+        <w:rPr>
+          <w:b/>
+          <w:bCs/>
+          <w:sz w:val="28"/>
+          <w:szCs w:val="28"/>
+        </w:rPr>
+      </w:pPr>
+    </w:p>
+    <w:p>
+      <w:pPr>
+        <w:spacing w:after="0"/>
+        <w:rPr>
+          <w:b/>
+          <w:bCs/>
+          <w:sz w:val="32"/>
+          <w:szCs w:val="32"/>
+        </w:rPr>
+      </w:pPr>
+      <w:r>
+        <w:rPr>
+          <w:b/>
+          <w:bCs/>
+          <w:sz w:val="32"/>
+          <w:szCs w:val="32"/>
+        </w:rPr>
+        <w:t>Output:</w:t>
+      </w:r>
+    </w:p>
+    <w:p>
+      <w:pPr>
+        <w:spacing w:after="0"/>
+        <w:rPr>
+          <w:b/>
+          <w:bCs/>
+          <w:sz w:val="32"/>
+          <w:szCs w:val="32"/>
+        </w:rPr>
+      </w:pPr>
+    </w:p>
+    <w:p>
+      <w:pPr>
+        <w:spacing w:after="0"/>
+        <w:rPr>
+          <w:b/>
+          <w:bCs/>
+          <w:sz w:val="32"/>
+          <w:szCs w:val="32"/>
+        </w:rPr>
+      </w:pPr>
+      <w:r>
+        <w:rPr>
+          <w:b/>
+          <w:bCs/>
+          <w:sz w:val="32"/>
+          <w:szCs w:val="32"/>
+        </w:rPr>
+        <w:drawing>
+          <wp:inline distT="0" distB="0" distL="0" distR="0" wp14:anchorId="25973A15" wp14:editId="3C8F20BF">
+            <wp:extent cx="4867275" cy="1905000"/>
+            <wp:effectExtent l="0" t="0" r="9525" b="0"/>
+            <wp:docPr id="3" name="Picture 3"/>
+            <wp:cNvGraphicFramePr>
+              <a:graphicFrameLocks xmlns:a="http://schemas.openxmlformats.org/drawingml/2006/main" noChangeAspect="1"/>
+            </wp:cNvGraphicFramePr>
+            <a:graphic xmlns:a="http://schemas.openxmlformats.org/drawingml/2006/main">
+              <a:graphicData uri="http://schemas.openxmlformats.org/drawingml/2006/picture">
+                <pic:pic xmlns:pic="http://schemas.openxmlformats.org/drawingml/2006/picture">
+                  <pic:nvPicPr>
+                    <pic:cNvPr id="1" name=""/>
+                    <pic:cNvPicPr/>
+                  </pic:nvPicPr>
+                  <pic:blipFill>
+                    <a:blip r:embed="rId6"/>
+                    <a:stretch>
+                      <a:fillRect/>
+                    </a:stretch>
+                  </pic:blipFill>
+                  <pic:spPr>
+                    <a:xfrm>
+                      <a:off x="0" y="0"/>
+                      <a:ext cx="4872947" cy="1907220"/>
+                    </a:xfrm>
+                    <a:prstGeom prst="rect">
+                      <a:avLst/>
+                    </a:prstGeom>
+                  </pic:spPr>
+                </pic:pic>
+              </a:graphicData>
+            </a:graphic>
+          </wp:inline>
+        </w:drawing>
+      </w:r>
+    </w:p>
+    <w:p>
+      <w:pPr>
+        <w:spacing w:after="0"/>
+        <w:rPr>
+          <w:b/>
+          <w:bCs/>
+          <w:sz w:val="28"/>
+          <w:szCs w:val="28"/>
+        </w:rPr>
+      </w:pPr>
+      <w:r>
+        <w:rPr>
+          <w:b/>
+          <w:bCs/>
+          <w:sz w:val="28"/>
+          <w:szCs w:val="28"/>
+        </w:rPr>
+        <w:lastRenderedPageBreak/>
+        <w:t>Program 4: Write a program to split a paragraph into individual sentences.</w:t>
+      </w:r>
+    </w:p>
+    <w:p>
+      <w:pPr>
+        <w:spacing w:after="0"/>
+      </w:pPr>
+    </w:p>
+    <w:p>
+      <w:pPr>
+        <w:spacing w:after="0"/>
+        <w:ind w:left="720"/>
+      </w:pPr>
+      <w:r>
+        <w:t>package plo1;</w:t>
+      </w:r>
+    </w:p>
+    <w:p>
+      <w:pPr>
+        <w:spacing w:after="0"/>
+        <w:ind w:left="720"/>
+      </w:pPr>
+    </w:p>
+    <w:p>
+      <w:pPr>
+        <w:spacing w:after="0"/>
+        <w:ind w:left="720"/>
+      </w:pPr>
+      <w:r>
+        <w:t>public class Program4 {</w:t>
+      </w:r>
+    </w:p>
+    <w:p>
+      <w:pPr>
+        <w:spacing w:after="0"/>
+        <w:ind w:left="720"/>
+      </w:pPr>
+    </w:p>
+    <w:p>
+      <w:pPr>
+        <w:spacing w:after="0"/>
+        <w:ind w:left="720"/>
+      </w:pPr>
+      <w:r>
+        <w:tab/>
+        <w:t xml:space="preserve">public static void </w:t>
+      </w:r>
+      <w:proofErr w:type="gramStart"/>
+      <w:r>
+        <w:t>main(</w:t>
+      </w:r>
+      <w:proofErr w:type="gramEnd"/>
+      <w:r>
+        <w:t xml:space="preserve">String[] </w:t>
+      </w:r>
+      <w:proofErr w:type="spellStart"/>
+      <w:r>
+        <w:t>args</w:t>
+      </w:r>
+      <w:proofErr w:type="spellEnd"/>
+      <w:r>
+        <w:t>) {</w:t>
+      </w:r>
+    </w:p>
+    <w:p>
+      <w:pPr>
+        <w:spacing w:after="0"/>
+        <w:ind w:left="720"/>
+      </w:pPr>
+      <w:r>
+        <w:tab/>
+      </w:r>
+      <w:r>
+        <w:tab/>
+        <w:t>// TODO Auto-generated method stub</w:t>
+      </w:r>
+    </w:p>
+    <w:p>
+      <w:pPr>
+        <w:spacing w:after="0"/>
+        <w:ind w:left="720"/>
+      </w:pPr>
+      <w:r>
+        <w:tab/>
+      </w:r>
+      <w:r>
+        <w:tab/>
+      </w:r>
+      <w:proofErr w:type="spellStart"/>
+      <w:r>
+        <w:t>System.</w:t>
+      </w:r>
+      <w:r>
+        <w:rPr>
+          <w:i/>
+          <w:iCs/>
+        </w:rPr>
+        <w:t>out</w:t>
+      </w:r>
+      <w:r>
+        <w:t>.println</w:t>
+      </w:r>
+      <w:proofErr w:type="spellEnd"/>
+      <w:r>
+        <w:t>("Program 4:");</w:t>
+      </w:r>
+    </w:p>
+    <w:p>
+      <w:pPr>
+        <w:spacing w:after="0"/>
+        <w:ind w:left="720"/>
+      </w:pPr>
+    </w:p>
+    <w:p>
+      <w:pPr>
+        <w:spacing w:after="0"/>
+        <w:ind w:left="720"/>
+      </w:pPr>
+      <w:r>
+        <w:tab/>
+      </w:r>
+      <w:r>
+        <w:tab/>
+        <w:t>String para = "This is the first sentence. Is this the second sentence? Yes! It is the third</w:t>
+      </w:r>
+      <w:r>
+        <w:t xml:space="preserve"> </w:t>
+      </w:r>
+      <w:r>
+        <w:t>one.";</w:t>
+      </w:r>
+    </w:p>
+    <w:p>
+      <w:pPr>
+        <w:spacing w:after="0"/>
+        <w:ind w:left="720"/>
+      </w:pPr>
+    </w:p>
+    <w:p>
+      <w:pPr>
+        <w:spacing w:after="0"/>
+        <w:ind w:left="720"/>
+      </w:pPr>
+      <w:r>
+        <w:t>// SPLIT THE PARAGRAPH INTO SENTENCES BASED ON DELIMITERS LIKE '.', '?';</w:t>
+      </w:r>
+    </w:p>
+    <w:p>
+      <w:pPr>
+        <w:spacing w:after="0"/>
+        <w:ind w:left="720"/>
+      </w:pPr>
+      <w:r>
+        <w:tab/>
+      </w:r>
+      <w:r>
+        <w:tab/>
+      </w:r>
+      <w:proofErr w:type="gramStart"/>
+      <w:r>
+        <w:t>String[</w:t>
+      </w:r>
+      <w:proofErr w:type="gramEnd"/>
+      <w:r>
+        <w:t xml:space="preserve">] sentences = </w:t>
+      </w:r>
+      <w:proofErr w:type="spellStart"/>
+      <w:r>
+        <w:t>para.split</w:t>
+      </w:r>
+      <w:proofErr w:type="spellEnd"/>
+      <w:r>
+        <w:t>("[.?!]");</w:t>
+      </w:r>
+    </w:p>
+    <w:p>
+      <w:pPr>
+        <w:spacing w:after="0"/>
+        <w:ind w:left="720"/>
+      </w:pPr>
+    </w:p>
+    <w:p>
+      <w:pPr>
+        <w:spacing w:after="0"/>
+        <w:ind w:left="720"/>
+      </w:pPr>
+      <w:r>
+        <w:t>// PRINT EACH SENTENCE</w:t>
+      </w:r>
+    </w:p>
+    <w:p>
+      <w:pPr>
+        <w:spacing w:after="0"/>
+        <w:ind w:left="720"/>
+      </w:pPr>
+      <w:r>
+        <w:tab/>
+      </w:r>
+      <w:r>
+        <w:tab/>
+      </w:r>
+      <w:proofErr w:type="spellStart"/>
+      <w:r>
+        <w:t>System.</w:t>
+      </w:r>
+      <w:r>
+        <w:rPr>
+          <w:i/>
+          <w:iCs/>
+        </w:rPr>
+        <w:t>out</w:t>
+      </w:r>
+      <w:r>
+        <w:t>.println</w:t>
+      </w:r>
+      <w:proofErr w:type="spellEnd"/>
+      <w:r>
+        <w:t>("\</w:t>
+      </w:r>
+      <w:proofErr w:type="spellStart"/>
+      <w:r>
+        <w:t>nSeparated</w:t>
+      </w:r>
+      <w:proofErr w:type="spellEnd"/>
+      <w:r>
+        <w:t xml:space="preserve"> Paragraph:");</w:t>
+      </w:r>
+    </w:p>
+    <w:p>
+      <w:pPr>
+        <w:spacing w:after="0"/>
+        <w:ind w:left="720"/>
+      </w:pPr>
+      <w:r>
+        <w:tab/>
+      </w:r>
+      <w:r>
+        <w:tab/>
+        <w:t xml:space="preserve">for (String </w:t>
+      </w:r>
+      <w:proofErr w:type="gramStart"/>
+      <w:r>
+        <w:t>str :</w:t>
+      </w:r>
+      <w:proofErr w:type="gramEnd"/>
+      <w:r>
+        <w:t xml:space="preserve"> sentences) {</w:t>
+      </w:r>
+    </w:p>
+    <w:p>
+      <w:pPr>
+        <w:spacing w:after="0"/>
+        <w:ind w:left="720"/>
+      </w:pPr>
+    </w:p>
+    <w:p>
+      <w:pPr>
+        <w:spacing w:after="0"/>
+        <w:ind w:left="720"/>
+      </w:pPr>
+      <w:r>
+        <w:t>// TRIM ANY LEADING/TRAILING WHITESPACES</w:t>
+      </w:r>
+    </w:p>
+    <w:p>
+      <w:pPr>
+        <w:spacing w:after="0"/>
+        <w:ind w:left="720"/>
+      </w:pPr>
+      <w:r>
+        <w:tab/>
+      </w:r>
+      <w:r>
+        <w:tab/>
+      </w:r>
+      <w:r>
+        <w:tab/>
+      </w:r>
+      <w:proofErr w:type="spellStart"/>
+      <w:r>
+        <w:t>System.</w:t>
+      </w:r>
+      <w:r>
+        <w:rPr>
+          <w:i/>
+          <w:iCs/>
+        </w:rPr>
+        <w:t>out</w:t>
+      </w:r>
+      <w:r>
+        <w:t>.println</w:t>
+      </w:r>
+      <w:proofErr w:type="spellEnd"/>
+      <w:r>
+        <w:t>(</w:t>
+      </w:r>
+      <w:proofErr w:type="spellStart"/>
+      <w:proofErr w:type="gramStart"/>
+      <w:r>
+        <w:t>str.trim</w:t>
+      </w:r>
+      <w:proofErr w:type="spellEnd"/>
+      <w:proofErr w:type="gramEnd"/>
+      <w:r>
+        <w:t>());</w:t>
+      </w:r>
+    </w:p>
+    <w:p>
+      <w:pPr>
+        <w:spacing w:after="0"/>
+        <w:ind w:left="720"/>
+      </w:pPr>
+      <w:r>
+        <w:tab/>
+      </w:r>
+      <w:r>
+        <w:tab/>
+        <w:t>}</w:t>
+      </w:r>
+    </w:p>
+    <w:p>
+      <w:pPr>
+        <w:spacing w:after="0"/>
+        <w:ind w:left="720"/>
+      </w:pPr>
+    </w:p>
+    <w:p>
+      <w:pPr>
+        <w:spacing w:after="0"/>
+        <w:ind w:left="720"/>
+      </w:pPr>
+      <w:r>
+        <w:tab/>
+        <w:t>}</w:t>
+      </w:r>
+    </w:p>
+    <w:p>
+      <w:pPr>
+        <w:spacing w:after="0"/>
+        <w:ind w:left="720"/>
+      </w:pPr>
+      <w:r>
+        <w:t>}</w:t>
+      </w:r>
+    </w:p>
+    <w:p>
+      <w:pPr>
+        <w:spacing w:after="0"/>
+      </w:pPr>
+    </w:p>
+    <w:p>
+      <w:pPr>
+        <w:spacing w:after="0"/>
+        <w:rPr>
+          <w:sz w:val="32"/>
+          <w:szCs w:val="32"/>
+        </w:rPr>
+      </w:pPr>
+      <w:r>
+        <w:rPr>
+          <w:sz w:val="32"/>
+          <w:szCs w:val="32"/>
+        </w:rPr>
+        <w:t>Output:</w:t>
+      </w:r>
+    </w:p>
+    <w:p>
+      <w:pPr>
+        <w:spacing w:after="0"/>
+        <w:rPr>
+          <w:sz w:val="32"/>
+          <w:szCs w:val="32"/>
+        </w:rPr>
+      </w:pPr>
+    </w:p>
+    <w:p>
+      <w:pPr>
+        <w:spacing w:after="0"/>
+        <w:rPr>
+          <w:sz w:val="32"/>
+          <w:szCs w:val="32"/>
+        </w:rPr>
+      </w:pPr>
+      <w:r>
+        <w:rPr>
+          <w:sz w:val="32"/>
+          <w:szCs w:val="32"/>
+        </w:rPr>
+        <w:drawing>
+          <wp:inline distT="0" distB="0" distL="0" distR="0" wp14:anchorId="091346E2" wp14:editId="00979627">
+            <wp:extent cx="3333750" cy="1733550"/>
+            <wp:effectExtent l="0" t="0" r="0" b="0"/>
+            <wp:docPr id="5" name="Picture 5"/>
+            <wp:cNvGraphicFramePr>
+              <a:graphicFrameLocks xmlns:a="http://schemas.openxmlformats.org/drawingml/2006/main" noChangeAspect="1"/>
+            </wp:cNvGraphicFramePr>
+            <a:graphic xmlns:a="http://schemas.openxmlformats.org/drawingml/2006/main">
+              <a:graphicData uri="http://schemas.openxmlformats.org/drawingml/2006/picture">
+                <pic:pic xmlns:pic="http://schemas.openxmlformats.org/drawingml/2006/picture">
+                  <pic:nvPicPr>
+                    <pic:cNvPr id="1" name=""/>
+                    <pic:cNvPicPr/>
+                  </pic:nvPicPr>
+                  <pic:blipFill>
+                    <a:blip r:embed="rId7"/>
+                    <a:stretch>
+                      <a:fillRect/>
+                    </a:stretch>
+                  </pic:blipFill>
+                  <pic:spPr>
+                    <a:xfrm>
+                      <a:off x="0" y="0"/>
+                      <a:ext cx="3344052" cy="1738907"/>
+                    </a:xfrm>
+                    <a:prstGeom prst="rect">
+                      <a:avLst/>
+                    </a:prstGeom>
+                  </pic:spPr>
+                </pic:pic>
+              </a:graphicData>
+            </a:graphic>
+          </wp:inline>
+        </w:drawing>
+      </w:r>
+    </w:p>
+    <w:p>
+      <w:pPr>
+        <w:spacing w:after="0"/>
+        <w:rPr>
+          <w:sz w:val="32"/>
+          <w:szCs w:val="32"/>
+        </w:rPr>
+      </w:pPr>
+    </w:p>
+    <w:p>
+      <w:pPr>
+        <w:spacing w:after="0"/>
+        <w:rPr>
+          <w:sz w:val="32"/>
+          <w:szCs w:val="32"/>
+        </w:rPr>
+      </w:pPr>
+    </w:p>
+    <w:p>
+      <w:pPr>
+        <w:spacing w:after="0"/>
+        <w:rPr>
+          <w:sz w:val="32"/>
+          <w:szCs w:val="32"/>
+        </w:rPr>
+      </w:pPr>
+    </w:p>
+    <w:p>
+      <w:pPr>
+        <w:spacing w:after="0"/>
+        <w:rPr>
+          <w:sz w:val="32"/>
+          <w:szCs w:val="32"/>
+        </w:rPr>
+      </w:pPr>
+    </w:p>
+    <w:p>
+      <w:pPr>
+        <w:spacing w:after="0"/>
+        <w:rPr>
+          <w:sz w:val="32"/>
+          <w:szCs w:val="32"/>
+        </w:rPr>
+      </w:pPr>
+    </w:p>
+    <w:p>
+      <w:pPr>
+        <w:spacing w:after="0"/>
+        <w:rPr>
+          <w:b/>
+          <w:bCs/>
+          <w:sz w:val="28"/>
+          <w:szCs w:val="28"/>
+        </w:rPr>
+      </w:pPr>
+      <w:r>
+        <w:rPr>
+          <w:b/>
+          <w:bCs/>
+          <w:sz w:val="28"/>
+          <w:szCs w:val="28"/>
+        </w:rPr>
+        <w:lastRenderedPageBreak/>
+        <w:t xml:space="preserve">Program 5: </w:t>
+      </w:r>
+      <w:r>
+        <w:rPr>
+          <w:b/>
+          <w:bCs/>
+          <w:sz w:val="28"/>
+          <w:szCs w:val="28"/>
+        </w:rPr>
+        <w:t xml:space="preserve"> Write a program to insert a substring into a string at a specific position using StringBuilder.</w:t>
+      </w:r>
+    </w:p>
+    <w:p>
+      <w:pPr>
+        <w:spacing w:after="0"/>
+        <w:rPr>
+          <w:b/>
+          <w:bCs/>
+          <w:sz w:val="28"/>
+          <w:szCs w:val="28"/>
+        </w:rPr>
+      </w:pPr>
+    </w:p>
+    <w:p>
+      <w:pPr>
+        <w:spacing w:after="0"/>
+        <w:ind w:left="720"/>
+      </w:pPr>
+      <w:r>
+        <w:t>package plo1;</w:t>
+      </w:r>
+    </w:p>
+    <w:p>
+      <w:pPr>
+        <w:spacing w:after="0"/>
+        <w:ind w:left="720"/>
+      </w:pPr>
+    </w:p>
+    <w:p>
+      <w:pPr>
+        <w:spacing w:after="0"/>
+        <w:ind w:left="720"/>
+      </w:pPr>
+      <w:r>
+        <w:t>public class Program5 {</w:t>
+      </w:r>
+    </w:p>
+    <w:p>
+      <w:pPr>
+        <w:spacing w:after="0"/>
+        <w:ind w:left="720"/>
+      </w:pPr>
+    </w:p>
+    <w:p>
+      <w:pPr>
+        <w:spacing w:after="0"/>
+        <w:ind w:left="720"/>
+      </w:pPr>
+      <w:r>
+        <w:tab/>
+        <w:t xml:space="preserve">public static void </w:t>
+      </w:r>
+      <w:proofErr w:type="gramStart"/>
+      <w:r>
+        <w:t>main(</w:t>
+      </w:r>
+      <w:proofErr w:type="gramEnd"/>
+      <w:r>
+        <w:t xml:space="preserve">String[] </w:t>
+      </w:r>
+      <w:proofErr w:type="spellStart"/>
+      <w:r>
+        <w:t>args</w:t>
+      </w:r>
+      <w:proofErr w:type="spellEnd"/>
+      <w:r>
+        <w:t>) {</w:t>
+      </w:r>
+    </w:p>
+    <w:p>
+      <w:pPr>
+        <w:spacing w:after="0"/>
+        <w:ind w:left="720"/>
+      </w:pPr>
+      <w:r>
+        <w:tab/>
+      </w:r>
+      <w:r>
+        <w:tab/>
+        <w:t>// TODO Auto-generated method stub</w:t>
+      </w:r>
+    </w:p>
+    <w:p>
+      <w:pPr>
+        <w:spacing w:after="0"/>
+        <w:ind w:left="720"/>
+      </w:pPr>
+    </w:p>
+    <w:p>
+      <w:pPr>
+        <w:spacing w:after="0"/>
+        <w:ind w:left="720"/>
+      </w:pPr>
+      <w:r>
+        <w:t>// PROGRAM 5:</w:t>
+      </w:r>
+    </w:p>
+    <w:p>
+      <w:pPr>
+        <w:spacing w:after="0"/>
+        <w:ind w:left="720"/>
+      </w:pPr>
+      <w:r>
+        <w:t xml:space="preserve">// WRITE A PROGRAM TO INSERT A SUBSTRING INTO A STRING AT A SPECIFIC </w:t>
+      </w:r>
+    </w:p>
+    <w:p>
+      <w:pPr>
+        <w:spacing w:after="0"/>
+        <w:ind w:left="720"/>
+      </w:pPr>
+      <w:r>
+        <w:t>// POSITION USING STRINGBULIDER;</w:t>
+      </w:r>
+    </w:p>
+    <w:p>
+      <w:pPr>
+        <w:spacing w:after="0"/>
+        <w:ind w:left="720"/>
+      </w:pPr>
+    </w:p>
+    <w:p>
+      <w:pPr>
+        <w:spacing w:after="0"/>
+        <w:ind w:left="720"/>
+      </w:pPr>
+      <w:r>
+        <w:tab/>
+      </w:r>
+      <w:r>
+        <w:tab/>
+      </w:r>
+      <w:proofErr w:type="spellStart"/>
+      <w:r>
+        <w:t>System.</w:t>
+      </w:r>
+      <w:r>
+        <w:rPr>
+          <w:i/>
+          <w:iCs/>
+        </w:rPr>
+        <w:t>out</w:t>
+      </w:r>
+      <w:r>
+        <w:t>.println</w:t>
+      </w:r>
+      <w:proofErr w:type="spellEnd"/>
+      <w:r>
+        <w:t xml:space="preserve">("Program </w:t>
+      </w:r>
+      <w:proofErr w:type="gramStart"/>
+      <w:r>
+        <w:t>5:\</w:t>
+      </w:r>
+      <w:proofErr w:type="gramEnd"/>
+      <w:r>
+        <w:t>n");</w:t>
+      </w:r>
+    </w:p>
+    <w:p>
+      <w:pPr>
+        <w:spacing w:after="0"/>
+        <w:ind w:left="720"/>
+      </w:pPr>
+      <w:r>
+        <w:tab/>
+      </w:r>
+      <w:r>
+        <w:tab/>
+        <w:t>String s = "</w:t>
+      </w:r>
+      <w:proofErr w:type="spellStart"/>
+      <w:r>
+        <w:t>Hellow</w:t>
+      </w:r>
+      <w:proofErr w:type="spellEnd"/>
+      <w:r>
+        <w:t xml:space="preserve"> World !!";</w:t>
+      </w:r>
+    </w:p>
+    <w:p>
+      <w:pPr>
+        <w:spacing w:after="0"/>
+        <w:ind w:left="720"/>
+      </w:pPr>
+      <w:r>
+        <w:tab/>
+      </w:r>
+      <w:r>
+        <w:tab/>
+        <w:t>String s1 = "Yash ";</w:t>
+      </w:r>
+    </w:p>
+    <w:p>
+      <w:pPr>
+        <w:spacing w:after="0"/>
+        <w:ind w:left="720"/>
+      </w:pPr>
+    </w:p>
+    <w:p>
+      <w:pPr>
+        <w:spacing w:after="0"/>
+        <w:ind w:left="720"/>
+      </w:pPr>
+      <w:r>
+        <w:tab/>
+      </w:r>
+      <w:r>
+        <w:tab/>
+        <w:t>StringBuilder sb = new StringBuilder(s);</w:t>
+      </w:r>
+    </w:p>
+    <w:p>
+      <w:pPr>
+        <w:spacing w:after="0"/>
+        <w:ind w:left="720"/>
+      </w:pPr>
+      <w:r>
+        <w:tab/>
+      </w:r>
+      <w:r>
+        <w:tab/>
+      </w:r>
+      <w:proofErr w:type="spellStart"/>
+      <w:proofErr w:type="gramStart"/>
+      <w:r>
+        <w:t>sb.insert</w:t>
+      </w:r>
+      <w:proofErr w:type="spellEnd"/>
+      <w:proofErr w:type="gramEnd"/>
+      <w:r>
+        <w:t>(7, s1);</w:t>
+      </w:r>
+    </w:p>
+    <w:p>
+      <w:pPr>
+        <w:spacing w:after="0"/>
+        <w:ind w:left="720"/>
+      </w:pPr>
+    </w:p>
+    <w:p>
+      <w:pPr>
+        <w:spacing w:after="0"/>
+        <w:ind w:left="720"/>
+      </w:pPr>
+      <w:r>
+        <w:tab/>
+      </w:r>
+      <w:r>
+        <w:tab/>
+      </w:r>
+      <w:proofErr w:type="spellStart"/>
+      <w:r>
+        <w:t>System.</w:t>
+      </w:r>
+      <w:r>
+        <w:rPr>
+          <w:i/>
+          <w:iCs/>
+        </w:rPr>
+        <w:t>out</w:t>
+      </w:r>
+      <w:r>
+        <w:t>.println</w:t>
+      </w:r>
+      <w:proofErr w:type="spellEnd"/>
+      <w:r>
+        <w:t xml:space="preserve">("String after insertion: " + </w:t>
+      </w:r>
+      <w:proofErr w:type="spellStart"/>
+      <w:proofErr w:type="gramStart"/>
+      <w:r>
+        <w:t>sb.toString</w:t>
+      </w:r>
+      <w:proofErr w:type="spellEnd"/>
+      <w:proofErr w:type="gramEnd"/>
+      <w:r>
+        <w:t>());</w:t>
+      </w:r>
+    </w:p>
+    <w:p>
+      <w:pPr>
+        <w:spacing w:after="0"/>
+        <w:ind w:left="720"/>
+      </w:pPr>
+    </w:p>
+    <w:p>
+      <w:pPr>
+        <w:spacing w:after="0"/>
+        <w:ind w:left="720"/>
+      </w:pPr>
+      <w:r>
+        <w:tab/>
+        <w:t>}</w:t>
+      </w:r>
+    </w:p>
+    <w:p>
+      <w:pPr>
+        <w:spacing w:after="0"/>
+        <w:ind w:left="720"/>
+      </w:pPr>
+    </w:p>
+    <w:p>
+      <w:pPr>
+        <w:spacing w:after="0"/>
+        <w:ind w:left="720"/>
+      </w:pPr>
+      <w:r>
+        <w:t>}</w:t>
+      </w:r>
+    </w:p>
+    <w:p>
+      <w:pPr>
+        <w:spacing w:after="0"/>
+        <w:rPr>
+          <w:b/>
+          <w:bCs/>
+          <w:sz w:val="28"/>
+          <w:szCs w:val="28"/>
+        </w:rPr>
+      </w:pPr>
+    </w:p>
+    <w:p>
+      <w:pPr>
+        <w:spacing w:after="0"/>
+        <w:rPr>
+          <w:b/>
+          <w:bCs/>
+          <w:sz w:val="32"/>
+          <w:szCs w:val="32"/>
+        </w:rPr>
+      </w:pPr>
+      <w:r>
+        <w:rPr>
+          <w:b/>
+          <w:bCs/>
+          <w:sz w:val="32"/>
+          <w:szCs w:val="32"/>
+        </w:rPr>
+        <w:t>Output:</w:t>
+      </w:r>
+    </w:p>
+    <w:p>
+      <w:pPr>
+        <w:spacing w:after="0"/>
+        <w:rPr>
+          <w:b/>
+          <w:bCs/>
+          <w:sz w:val="32"/>
+          <w:szCs w:val="32"/>
+        </w:rPr>
+      </w:pPr>
+    </w:p>
+    <w:p>
+      <w:pPr>
+        <w:spacing w:after="0"/>
+        <w:rPr>
+          <w:b/>
+          <w:bCs/>
+          <w:sz w:val="32"/>
+          <w:szCs w:val="32"/>
+        </w:rPr>
+      </w:pPr>
+      <w:r>
+        <w:rPr>
+          <w:b/>
+          <w:bCs/>
+          <w:sz w:val="32"/>
+          <w:szCs w:val="32"/>
+        </w:rPr>
+        <w:drawing>
+          <wp:inline distT="0" distB="0" distL="0" distR="0" wp14:anchorId="4B88B6B6" wp14:editId="0B1D394A">
+            <wp:extent cx="4546188" cy="1028700"/>
+            <wp:effectExtent l="0" t="0" r="6985" b="0"/>
+            <wp:docPr id="7" name="Picture 7"/>
+            <wp:cNvGraphicFramePr>
+              <a:graphicFrameLocks xmlns:a="http://schemas.openxmlformats.org/drawingml/2006/main" noChangeAspect="1"/>
+            </wp:cNvGraphicFramePr>
+            <a:graphic xmlns:a="http://schemas.openxmlformats.org/drawingml/2006/main">
+              <a:graphicData uri="http://schemas.openxmlformats.org/drawingml/2006/picture">
+                <pic:pic xmlns:pic="http://schemas.openxmlformats.org/drawingml/2006/picture">
+                  <pic:nvPicPr>
+                    <pic:cNvPr id="1" name=""/>
+                    <pic:cNvPicPr/>
+                  </pic:nvPicPr>
+                  <pic:blipFill>
+                    <a:blip r:embed="rId8"/>
+                    <a:stretch>
+                      <a:fillRect/>
+                    </a:stretch>
+                  </pic:blipFill>
+                  <pic:spPr>
+                    <a:xfrm>
+                      <a:off x="0" y="0"/>
+                      <a:ext cx="4548908" cy="1029316"/>
+                    </a:xfrm>
+                    <a:prstGeom prst="rect">
+                      <a:avLst/>
+                    </a:prstGeom>
+                  </pic:spPr>
+                </pic:pic>
+              </a:graphicData>
+            </a:graphic>
+          </wp:inline>
+        </w:drawing>
+      </w:r>
+    </w:p>
+    <w:p>
+      <w:pPr>
+        <w:spacing w:after="0"/>
+        <w:rPr>
+          <w:b/>
+          <w:bCs/>
+          <w:sz w:val="32"/>
+          <w:szCs w:val="32"/>
+        </w:rPr>
+      </w:pPr>
+    </w:p>
+    <w:p>
+      <w:pPr>
+        <w:spacing w:after="0"/>
+        <w:rPr>
+          <w:b/>
+          <w:bCs/>
+          <w:sz w:val="32"/>
+          <w:szCs w:val="32"/>
+        </w:rPr>
+      </w:pPr>
+    </w:p>
+    <w:p>
+      <w:pPr>
+        <w:spacing w:after="0"/>
+        <w:rPr>
+          <w:b/>
+          <w:bCs/>
+          <w:sz w:val="32"/>
+          <w:szCs w:val="32"/>
+        </w:rPr>
+      </w:pPr>
+    </w:p>
+    <w:p>
+      <w:pPr>
+        <w:spacing w:after="0"/>
+        <w:rPr>
+          <w:b/>
+          <w:bCs/>
+          <w:sz w:val="32"/>
+          <w:szCs w:val="32"/>
+        </w:rPr>
+      </w:pPr>
+    </w:p>
+    <w:p>
+      <w:pPr>
+        <w:spacing w:after="0"/>
+        <w:rPr>
+          <w:b/>
+          <w:bCs/>
+          <w:sz w:val="32"/>
+          <w:szCs w:val="32"/>
+        </w:rPr>
+      </w:pPr>
+    </w:p>
+    <w:p>
+      <w:pPr>
+        <w:spacing w:after="0"/>
+        <w:rPr>
+          <w:b/>
+          <w:bCs/>
+          <w:sz w:val="32"/>
+          <w:szCs w:val="32"/>
+        </w:rPr>
+      </w:pPr>
+    </w:p>
+    <w:p>
+      <w:pPr>
+        <w:spacing w:after="0"/>
+        <w:rPr>
+          <w:b/>
+          <w:bCs/>
+          <w:sz w:val="32"/>
+          <w:szCs w:val="32"/>
+        </w:rPr>
+      </w:pPr>
+    </w:p>
+    <w:p>
+      <w:pPr>
+        <w:spacing w:after="0"/>
+        <w:rPr>
+          <w:b/>
+          <w:bCs/>
+          <w:sz w:val="32"/>
+          <w:szCs w:val="32"/>
+        </w:rPr>
+      </w:pPr>
+    </w:p>
+    <w:p>
+      <w:pPr>
+        <w:spacing w:after="0"/>
+        <w:rPr>
+          <w:b/>
+          <w:bCs/>
+          <w:sz w:val="28"/>
+          <w:szCs w:val="28"/>
+        </w:rPr>
+      </w:pPr>
+      <w:r>
+        <w:rPr>
+          <w:b/>
+          <w:bCs/>
+          <w:sz w:val="28"/>
+          <w:szCs w:val="28"/>
+        </w:rPr>
+        <w:lastRenderedPageBreak/>
+        <w:t xml:space="preserve">Program </w:t>
+      </w:r>
+      <w:r>
+        <w:rPr>
+          <w:b/>
+          <w:bCs/>
+          <w:sz w:val="28"/>
+          <w:szCs w:val="28"/>
+        </w:rPr>
+        <w:t>6</w:t>
+      </w:r>
+      <w:r>
+        <w:rPr>
+          <w:b/>
+          <w:bCs/>
+          <w:sz w:val="28"/>
+          <w:szCs w:val="28"/>
+        </w:rPr>
+        <w:t>:</w:t>
+      </w:r>
+      <w:r>
+        <w:rPr>
+          <w:b/>
+          <w:bCs/>
+          <w:sz w:val="28"/>
+          <w:szCs w:val="28"/>
+        </w:rPr>
+        <w:t xml:space="preserve"> </w:t>
+      </w:r>
+      <w:r>
+        <w:rPr>
+          <w:b/>
+          <w:bCs/>
+          <w:sz w:val="28"/>
+          <w:szCs w:val="28"/>
+        </w:rPr>
+        <w:tab/>
+        <w:t>Write a program to convert a Data object to a string in a specific format.</w:t>
+      </w:r>
+    </w:p>
+    <w:p>
+      <w:pPr>
+        <w:spacing w:after="0"/>
+        <w:rPr>
+          <w:b/>
+          <w:bCs/>
+          <w:sz w:val="28"/>
+          <w:szCs w:val="28"/>
+        </w:rPr>
+      </w:pPr>
+    </w:p>
+    <w:p>
+      <w:pPr>
+        <w:spacing w:after="0"/>
+        <w:ind w:left="720"/>
+      </w:pPr>
+      <w:r>
+        <w:t>package plo1;</w:t>
+      </w:r>
+    </w:p>
+    <w:p>
+      <w:pPr>
+        <w:spacing w:after="0"/>
+        <w:ind w:left="720"/>
+      </w:pPr>
+    </w:p>
+    <w:p>
+      <w:pPr>
+        <w:spacing w:after="0"/>
+        <w:ind w:left="720"/>
+      </w:pPr>
+      <w:r>
+        <w:t xml:space="preserve">import </w:t>
+      </w:r>
+      <w:proofErr w:type="spellStart"/>
+      <w:r>
+        <w:t>java.</w:t>
+      </w:r>
+      <w:proofErr w:type="gramStart"/>
+      <w:r>
+        <w:t>text.SimpleDateFormat</w:t>
+      </w:r>
+      <w:proofErr w:type="spellEnd"/>
+      <w:proofErr w:type="gramEnd"/>
+      <w:r>
+        <w:t>;</w:t>
+      </w:r>
+    </w:p>
+    <w:p>
+      <w:pPr>
+        <w:spacing w:after="0"/>
+        <w:ind w:left="720"/>
+      </w:pPr>
+      <w:r>
+        <w:t xml:space="preserve">import </w:t>
+      </w:r>
+      <w:proofErr w:type="spellStart"/>
+      <w:proofErr w:type="gramStart"/>
+      <w:r>
+        <w:t>java.util</w:t>
+      </w:r>
+      <w:proofErr w:type="gramEnd"/>
+      <w:r>
+        <w:t>.Date</w:t>
+      </w:r>
+      <w:proofErr w:type="spellEnd"/>
+      <w:r>
+        <w:t>;</w:t>
+      </w:r>
+    </w:p>
+    <w:p>
+      <w:pPr>
+        <w:spacing w:after="0"/>
+        <w:ind w:left="720"/>
+      </w:pPr>
+    </w:p>
+    <w:p>
+      <w:pPr>
+        <w:spacing w:after="0"/>
+        <w:ind w:left="720"/>
+      </w:pPr>
+      <w:r>
+        <w:t>public class Program6 {</w:t>
+      </w:r>
+    </w:p>
+    <w:p>
+      <w:pPr>
+        <w:spacing w:after="0"/>
+        <w:ind w:left="720"/>
+      </w:pPr>
+      <w:r>
+        <w:tab/>
+        <w:t xml:space="preserve">public static void </w:t>
+      </w:r>
+      <w:proofErr w:type="gramStart"/>
+      <w:r>
+        <w:t>main(</w:t>
+      </w:r>
+      <w:proofErr w:type="gramEnd"/>
+      <w:r>
+        <w:t xml:space="preserve">String[] </w:t>
+      </w:r>
+      <w:proofErr w:type="spellStart"/>
+      <w:r>
+        <w:t>args</w:t>
+      </w:r>
+      <w:proofErr w:type="spellEnd"/>
+      <w:r>
+        <w:t>) {</w:t>
+      </w:r>
+    </w:p>
+    <w:p>
+      <w:pPr>
+        <w:spacing w:after="0"/>
+        <w:ind w:left="720"/>
+      </w:pPr>
+      <w:r>
+        <w:tab/>
+      </w:r>
+      <w:r>
+        <w:tab/>
+      </w:r>
+      <w:proofErr w:type="spellStart"/>
+      <w:r>
+        <w:t>System.out.println</w:t>
+      </w:r>
+      <w:proofErr w:type="spellEnd"/>
+      <w:r>
+        <w:t xml:space="preserve">("Program </w:t>
+      </w:r>
+      <w:proofErr w:type="gramStart"/>
+      <w:r>
+        <w:t>6:\</w:t>
+      </w:r>
+      <w:proofErr w:type="gramEnd"/>
+      <w:r>
+        <w:t>n");</w:t>
+      </w:r>
+    </w:p>
+    <w:p>
+      <w:pPr>
+        <w:spacing w:after="0"/>
+        <w:ind w:left="720"/>
+      </w:pPr>
+    </w:p>
+    <w:p>
+      <w:pPr>
+        <w:spacing w:after="0"/>
+        <w:ind w:left="720"/>
+      </w:pPr>
+      <w:r>
+        <w:t>// CREATE A DATE OBJECT REPRESENTING THE CURRENT DATE AND TIME;</w:t>
+      </w:r>
+    </w:p>
+    <w:p>
+      <w:pPr>
+        <w:spacing w:after="0"/>
+        <w:ind w:left="720"/>
+      </w:pPr>
+      <w:r>
+        <w:tab/>
+      </w:r>
+      <w:r>
+        <w:tab/>
+        <w:t xml:space="preserve">Date </w:t>
+      </w:r>
+      <w:proofErr w:type="spellStart"/>
+      <w:r>
+        <w:t>currDate</w:t>
+      </w:r>
+      <w:proofErr w:type="spellEnd"/>
+      <w:r>
+        <w:t xml:space="preserve"> = new </w:t>
+      </w:r>
+      <w:proofErr w:type="gramStart"/>
+      <w:r>
+        <w:t>Date(</w:t>
+      </w:r>
+      <w:proofErr w:type="gramEnd"/>
+      <w:r>
+        <w:t>);</w:t>
+      </w:r>
+    </w:p>
+    <w:p>
+      <w:pPr>
+        <w:spacing w:after="0"/>
+        <w:ind w:left="720"/>
+      </w:pPr>
+    </w:p>
+    <w:p>
+      <w:pPr>
+        <w:spacing w:after="0"/>
+        <w:ind w:left="720"/>
+      </w:pPr>
+      <w:r>
+        <w:t>// DEFINE THE DESIRED FORMAT;</w:t>
+      </w:r>
+    </w:p>
+    <w:p>
+      <w:pPr>
+        <w:spacing w:after="0"/>
+        <w:ind w:left="720"/>
+      </w:pPr>
+      <w:r>
+        <w:tab/>
+      </w:r>
+      <w:r>
+        <w:tab/>
+      </w:r>
+      <w:proofErr w:type="spellStart"/>
+      <w:r>
+        <w:t>SimpleDateFormat</w:t>
+      </w:r>
+      <w:proofErr w:type="spellEnd"/>
+      <w:r>
+        <w:t xml:space="preserve"> format = new </w:t>
+      </w:r>
+      <w:proofErr w:type="spellStart"/>
+      <w:proofErr w:type="gramStart"/>
+      <w:r>
+        <w:t>SimpleDateFormat</w:t>
+      </w:r>
+      <w:proofErr w:type="spellEnd"/>
+      <w:r>
+        <w:t>(</w:t>
+      </w:r>
+      <w:proofErr w:type="gramEnd"/>
+      <w:r>
+        <w:t xml:space="preserve">"dd MMM </w:t>
+      </w:r>
+      <w:proofErr w:type="spellStart"/>
+      <w:r>
+        <w:t>yyyy</w:t>
+      </w:r>
+      <w:proofErr w:type="spellEnd"/>
+      <w:r>
+        <w:t>");</w:t>
+      </w:r>
+    </w:p>
+    <w:p>
+      <w:pPr>
+        <w:spacing w:after="0"/>
+        <w:ind w:left="720"/>
+      </w:pPr>
+    </w:p>
+    <w:p>
+      <w:pPr>
+        <w:spacing w:after="0"/>
+        <w:ind w:left="720"/>
+      </w:pPr>
+      <w:r>
+        <w:t>// CONVERT THE DATE OBJECT INTO A STRING IN THE SPECIFIED FORMAT;</w:t>
+      </w:r>
+    </w:p>
+    <w:p>
+      <w:pPr>
+        <w:spacing w:after="0"/>
+        <w:ind w:left="720"/>
+      </w:pPr>
+      <w:r>
+        <w:tab/>
+      </w:r>
+      <w:r>
+        <w:tab/>
+        <w:t xml:space="preserve">String </w:t>
+      </w:r>
+      <w:proofErr w:type="spellStart"/>
+      <w:r>
+        <w:t>formattedDate</w:t>
+      </w:r>
+      <w:proofErr w:type="spellEnd"/>
+      <w:r>
+        <w:t xml:space="preserve"> = </w:t>
+      </w:r>
+      <w:proofErr w:type="spellStart"/>
+      <w:proofErr w:type="gramStart"/>
+      <w:r>
+        <w:t>format.format</w:t>
+      </w:r>
+      <w:proofErr w:type="spellEnd"/>
+      <w:proofErr w:type="gramEnd"/>
+      <w:r>
+        <w:t>(</w:t>
+      </w:r>
+      <w:proofErr w:type="spellStart"/>
+      <w:r>
+        <w:t>currDate</w:t>
+      </w:r>
+      <w:proofErr w:type="spellEnd"/>
+      <w:r>
+        <w:t>);</w:t>
+      </w:r>
+    </w:p>
+    <w:p>
+      <w:pPr>
+        <w:spacing w:after="0"/>
+        <w:ind w:left="720"/>
+      </w:pPr>
+    </w:p>
+    <w:p>
+      <w:pPr>
+        <w:spacing w:after="0"/>
+        <w:ind w:left="720"/>
+      </w:pPr>
+      <w:r>
+        <w:t>// PRINT THE FORMATTED DATE;</w:t>
+      </w:r>
+    </w:p>
+    <w:p>
+      <w:pPr>
+        <w:spacing w:after="0"/>
+        <w:ind w:left="720"/>
+      </w:pPr>
+      <w:r>
+        <w:tab/>
+      </w:r>
+      <w:r>
+        <w:tab/>
+      </w:r>
+      <w:proofErr w:type="spellStart"/>
+      <w:r>
+        <w:t>System.out.println</w:t>
+      </w:r>
+      <w:proofErr w:type="spellEnd"/>
+      <w:r>
+        <w:t xml:space="preserve">("Formatted Date: " + </w:t>
+      </w:r>
+      <w:proofErr w:type="spellStart"/>
+      <w:r>
+        <w:t>formattedDate</w:t>
+      </w:r>
+      <w:proofErr w:type="spellEnd"/>
+      <w:r>
+        <w:t>);</w:t>
+      </w:r>
+    </w:p>
+    <w:p>
+      <w:pPr>
+        <w:spacing w:after="0"/>
+        <w:ind w:left="720"/>
+      </w:pPr>
+      <w:r>
+        <w:tab/>
+        <w:t>}</w:t>
+      </w:r>
+    </w:p>
+    <w:p>
+      <w:pPr>
+        <w:spacing w:after="0"/>
+        <w:ind w:left="720"/>
+      </w:pPr>
+      <w:r>
+        <w:t>}</w:t>
+      </w:r>
+    </w:p>
+    <w:p>
+      <w:pPr>
+        <w:spacing w:after="0"/>
+        <w:ind w:left="720"/>
+      </w:pPr>
+    </w:p>
+    <w:p>
+      <w:pPr>
+        <w:spacing w:after="0"/>
+        <w:ind w:left="720"/>
+      </w:pPr>
+    </w:p>
+    <w:p>
+      <w:pPr>
+        <w:spacing w:after="0"/>
+        <w:ind w:left="720"/>
+      </w:pPr>
+    </w:p>
+    <w:p>
+      <w:pPr>
+        <w:spacing w:after="0"/>
+        <w:ind w:left="720"/>
+        <w:rPr>
+          <w:sz w:val="32"/>
+          <w:szCs w:val="32"/>
+        </w:rPr>
+      </w:pPr>
+      <w:r>
+        <w:rPr>
+          <w:sz w:val="32"/>
+          <w:szCs w:val="32"/>
+        </w:rPr>
+        <w:t xml:space="preserve">Output: </w:t>
+      </w:r>
+    </w:p>
+    <w:p>
+      <w:pPr>
+        <w:spacing w:after="0"/>
+        <w:ind w:left="720"/>
+        <w:rPr>
+          <w:sz w:val="32"/>
+          <w:szCs w:val="32"/>
+        </w:rPr>
+      </w:pPr>
+    </w:p>
+    <w:p>
+      <w:pPr>
+        <w:spacing w:after="0"/>
+        <w:ind w:left="720"/>
+        <w:rPr>
+          <w:sz w:val="32"/>
+          <w:szCs w:val="32"/>
+        </w:rPr>
+      </w:pPr>
+      <w:r>
+        <w:rPr>
+          <w:sz w:val="32"/>
+          <w:szCs w:val="32"/>
+        </w:rPr>
+        <w:drawing>
+          <wp:inline distT="0" distB="0" distL="0" distR="0" wp14:anchorId="7FAB0017" wp14:editId="146F3844">
+            <wp:extent cx="3159579" cy="942975"/>
+            <wp:effectExtent l="0" t="0" r="3175" b="0"/>
+            <wp:docPr id="9" name="Picture 9"/>
+            <wp:cNvGraphicFramePr>
+              <a:graphicFrameLocks xmlns:a="http://schemas.openxmlformats.org/drawingml/2006/main" noChangeAspect="1"/>
+            </wp:cNvGraphicFramePr>
+            <a:graphic xmlns:a="http://schemas.openxmlformats.org/drawingml/2006/main">
+              <a:graphicData uri="http://schemas.openxmlformats.org/drawingml/2006/picture">
+                <pic:pic xmlns:pic="http://schemas.openxmlformats.org/drawingml/2006/picture">
+                  <pic:nvPicPr>
+                    <pic:cNvPr id="1" name=""/>
+                    <pic:cNvPicPr/>
+                  </pic:nvPicPr>
+                  <pic:blipFill>
+                    <a:blip r:embed="rId9"/>
+                    <a:stretch>
+                      <a:fillRect/>
+                    </a:stretch>
+                  </pic:blipFill>
+                  <pic:spPr>
+                    <a:xfrm>
+                      <a:off x="0" y="0"/>
+                      <a:ext cx="3166008" cy="944894"/>
+                    </a:xfrm>
+                    <a:prstGeom prst="rect">
+                      <a:avLst/>
+                    </a:prstGeom>
+                  </pic:spPr>
+                </pic:pic>
+              </a:graphicData>
+            </a:graphic>
+          </wp:inline>
+        </w:drawing>
+      </w:r>
+    </w:p>
+    <w:p>
+      <w:pPr>
+        <w:spacing w:after="0"/>
+        <w:ind w:left="720"/>
+        <w:rPr>
+          <w:sz w:val="32"/>
+          <w:szCs w:val="32"/>
+        </w:rPr>
       </w:pPr>
     </w:p>
     <w:sectPr>
@@ -1788,7 +4899,6 @@
   <w:style w:type="character" w:default="1" w:styleId="DefaultParagraphFont">
     <w:name w:val="Default Paragraph Font"/>
     <w:uiPriority w:val="1"/>
-    <w:semiHidden/>
     <w:unhideWhenUsed/>
   </w:style>
   <w:style w:type="table" w:default="1" w:styleId="TableNormal">

</xml_diff>